<commit_message>
LSD e imputación de conceptos de sueldos, contratos de venta, canon municipal, remesas e Interbanking.
Incluye asientos/solicitud de pago desde liquidación, tags de concepto de venta, unificación de clientes UIF, CBU en pagos, mejoras de cierre máquina/gastronomía y Flash AGG.

Co-authored-by: Cursor <cursoragent@cursor.com>
</commit_message>
<xml_diff>
--- a/docs/manual-ventas/Manual_Usuario_AnitaERP_Pedidos_Facturacion.docx
+++ b/docs/manual-ventas/Manual_Usuario_AnitaERP_Pedidos_Facturacion.docx
@@ -34,7 +34,7 @@
           <w:b w:val="1"/>
           <w:bCs w:val="1"/>
         </w:rPr>
-        <w:t xml:space="preserve">Anita ERP — Pedidos y Facturación</w:t>
+        <w:t xml:space="preserve">Anita ERP — Pedidos, Facturación y Abonos</w:t>
       </w:r>
     </w:p>
     <w:p/>
@@ -48,7 +48,7 @@
           <w:sz w:val="24"/>
           <w:szCs w:val="24"/>
         </w:rPr>
-        <w:t xml:space="preserve">Empresa: </w:t>
+        <w:t xml:space="preserve">Empresa: AGG</w:t>
       </w:r>
     </w:p>
     <w:p>
@@ -60,7 +60,7 @@
           <w:sz w:val="22"/>
           <w:szCs w:val="22"/>
         </w:rPr>
-        <w:t xml:space="preserve">Versión 1.1 — agosto 2026</w:t>
+        <w:t xml:space="preserve">Versión 1.2 — agosto 2026</w:t>
       </w:r>
     </w:p>
     <w:p/>
@@ -74,7 +74,7 @@
           <w:sz w:val="20"/>
           <w:szCs w:val="20"/>
         </w:rPr>
-        <w:t xml:space="preserve">URL: http://10.20.30.210/seguridad/login</w:t>
+        <w:t xml:space="preserve">URL: http://10.20.30.210/anitaERP/public/seguridad/login</w:t>
       </w:r>
     </w:p>
     <w:p>
@@ -223,6 +223,76 @@
       </w:r>
     </w:p>
     <w:p>
+      <w:pPr/>
+      <w:r>
+        <w:rPr>
+          <w:sz w:val="22"/>
+          <w:szCs w:val="22"/>
+        </w:rPr>
+        <w:t xml:space="preserve">14. Módulo Abonos — visión general</w:t>
+      </w:r>
+    </w:p>
+    <w:p>
+      <w:pPr/>
+      <w:r>
+        <w:rPr>
+          <w:sz w:val="22"/>
+          <w:szCs w:val="22"/>
+        </w:rPr>
+        <w:t xml:space="preserve">15. Conceptos de venta y plantillas</w:t>
+      </w:r>
+    </w:p>
+    <w:p>
+      <w:pPr/>
+      <w:r>
+        <w:rPr>
+          <w:sz w:val="22"/>
+          <w:szCs w:val="22"/>
+        </w:rPr>
+        <w:t xml:space="preserve">16. Tags de sistema y condicionales</w:t>
+      </w:r>
+    </w:p>
+    <w:p>
+      <w:pPr/>
+      <w:r>
+        <w:rPr>
+          <w:sz w:val="22"/>
+          <w:szCs w:val="22"/>
+        </w:rPr>
+        <w:t xml:space="preserve">17. Abonos / contratos de cliente</w:t>
+      </w:r>
+    </w:p>
+    <w:p>
+      <w:pPr/>
+      <w:r>
+        <w:rPr>
+          <w:sz w:val="22"/>
+          <w:szCs w:val="22"/>
+        </w:rPr>
+        <w:t xml:space="preserve">18. Cola de facturación de abonos</w:t>
+      </w:r>
+    </w:p>
+    <w:p>
+      <w:pPr/>
+      <w:r>
+        <w:rPr>
+          <w:sz w:val="22"/>
+          <w:szCs w:val="22"/>
+        </w:rPr>
+        <w:t xml:space="preserve">19. Facturar un abono (paso a paso)</w:t>
+      </w:r>
+    </w:p>
+    <w:p>
+      <w:pPr/>
+      <w:r>
+        <w:rPr>
+          <w:sz w:val="22"/>
+          <w:szCs w:val="22"/>
+        </w:rPr>
+        <w:t xml:space="preserve">20. Avisos de vencimiento de abonos</w:t>
+      </w:r>
+    </w:p>
+    <w:p>
       <w:r>
         <w:br w:type="page"/>
       </w:r>
@@ -247,7 +317,7 @@
           <w:sz w:val="22"/>
           <w:szCs w:val="22"/>
         </w:rPr>
-        <w:t xml:space="preserve">Este manual describe el proceso de pedidos de venta y su facturación en Anita ERP, adaptado a la operatoria de EL BIERZO, donde la mercadería se comercializa en cajas, piezas y kilos, y el importe facturado se basa en la pesada real registrada en planta.</w:t>
+        <w:t xml:space="preserve">Este manual describe dos circuitos de Ventas en Anita ERP: (A) pedidos de mercadería con pesada y facturación en planta, y (B) abonos / contratos de servicio con conceptos, tags y cola de facturación periódica.</w:t>
       </w:r>
     </w:p>
     <w:p>
@@ -260,7 +330,33 @@
           <w:sz w:val="22"/>
           <w:szCs w:val="22"/>
         </w:rPr>
-        <w:t xml:space="preserve">El circuito involucra dos perfiles principales:</w:t>
+        <w:t xml:space="preserve">El circuito de pedidos (EL BIERZO) comercializa en cajas, piezas y kilos; el importe facturado se basa en la pesada real registrada en planta.</w:t>
+      </w:r>
+    </w:p>
+    <w:p>
+      <w:pPr>
+        <w:jc w:val="both"/>
+        <w:spacing w:after="120"/>
+      </w:pPr>
+      <w:r>
+        <w:rPr>
+          <w:sz w:val="22"/>
+          <w:szCs w:val="22"/>
+        </w:rPr>
+        <w:t xml:space="preserve">El circuito de abonos (menú Ventas → Abonos) gestiona servicios recurrentes: conceptos con plantillas de texto fiscal, contratos por cliente, períodos a facturar y avisos de vencimiento. No forma parte de «Tablas de ventas»: es un módulo operativo.</w:t>
+      </w:r>
+    </w:p>
+    <w:p>
+      <w:pPr>
+        <w:jc w:val="both"/>
+        <w:spacing w:after="120"/>
+      </w:pPr>
+      <w:r>
+        <w:rPr>
+          <w:sz w:val="22"/>
+          <w:szCs w:val="22"/>
+        </w:rPr>
+        <w:t xml:space="preserve">Perfiles del circuito de pedidos:</w:t>
       </w:r>
     </w:p>
     <w:p>
@@ -275,7 +371,7 @@
           <w:i w:val="1"/>
           <w:iCs w:val="1"/>
         </w:rPr>
-        <w:t xml:space="preserve">Los pedidos cargados por vendedores remotos quedan registrados en el sistema y se listan físicamente en la empresa (impresión en papel o PDF) para que depósito y logística preparen la mercadería. La facturación se realiza en planta, una vez pesada la mercadería.</w:t>
+        <w:t xml:space="preserve">Los pedidos cargados por vendedores remotos quedan registrados en el sistema y se listan físicamente en la empresa (impresión en papel o PDF) para que depósito y logística preparen la mercadería. La facturación se realiza en planta, una vez pesada la mercadería. Los abonos se facturan desde el facturador o desde la cola de abonos, con descripción ya resuelta (sin tags pendientes).</w:t>
       </w:r>
     </w:p>
     <w:p>
@@ -300,6 +396,18 @@
       <w:r>
         <w:rPr/>
         <w:t xml:space="preserve">Personal de planta / administración (en la empresa): ve el listado de pedidos, los imprime para preparación y despacho, registra la pesada escaneando códigos QR de las cajas, y emite remito y factura.</w:t>
+      </w:r>
+    </w:p>
+    <w:p>
+      <w:pPr>
+        <w:numPr>
+          <w:ilvl w:val="0"/>
+          <w:numId w:val=""/>
+        </w:numPr>
+      </w:pPr>
+      <w:r>
+        <w:rPr/>
+        <w:t xml:space="preserve">Administración / facturación (abonos): da de alta conceptos y abonos, completa tags al emitir, y factura períodos desde la cola.</w:t>
       </w:r>
     </w:p>
     <w:p/>
@@ -705,6 +813,210 @@
                 <w:szCs w:val="20"/>
               </w:rPr>
               <w:t xml:space="preserve">Administración</w:t>
+            </w:r>
+          </w:p>
+        </w:tc>
+      </w:tr>
+      <w:tr>
+        <w:trPr/>
+        <w:tc>
+          <w:tcPr>
+            <w:tcW w:w="2800" w:type="dxa"/>
+            <w:noWrap/>
+          </w:tcPr>
+          <w:p>
+            <w:pPr/>
+            <w:r>
+              <w:rPr>
+                <w:sz w:val="20"/>
+                <w:szCs w:val="20"/>
+              </w:rPr>
+              <w:t xml:space="preserve">Conceptos de venta</w:t>
+            </w:r>
+          </w:p>
+        </w:tc>
+        <w:tc>
+          <w:tcPr>
+            <w:tcW w:w="2800" w:type="dxa"/>
+            <w:noWrap/>
+          </w:tcPr>
+          <w:p>
+            <w:pPr/>
+            <w:r>
+              <w:rPr>
+                <w:sz w:val="20"/>
+                <w:szCs w:val="20"/>
+              </w:rPr>
+              <w:t xml:space="preserve">ventas/concepto-venta</w:t>
+            </w:r>
+          </w:p>
+        </w:tc>
+        <w:tc>
+          <w:tcPr>
+            <w:tcW w:w="2800" w:type="dxa"/>
+            <w:noWrap/>
+          </w:tcPr>
+          <w:p>
+            <w:pPr/>
+            <w:r>
+              <w:rPr>
+                <w:sz w:val="20"/>
+                <w:szCs w:val="20"/>
+              </w:rPr>
+              <w:t xml:space="preserve">Administración / facturación</w:t>
+            </w:r>
+          </w:p>
+        </w:tc>
+      </w:tr>
+      <w:tr>
+        <w:trPr/>
+        <w:tc>
+          <w:tcPr>
+            <w:tcW w:w="2800" w:type="dxa"/>
+            <w:noWrap/>
+          </w:tcPr>
+          <w:p>
+            <w:pPr/>
+            <w:r>
+              <w:rPr>
+                <w:sz w:val="20"/>
+                <w:szCs w:val="20"/>
+              </w:rPr>
+              <w:t xml:space="preserve">Abonos / contratos</w:t>
+            </w:r>
+          </w:p>
+        </w:tc>
+        <w:tc>
+          <w:tcPr>
+            <w:tcW w:w="2800" w:type="dxa"/>
+            <w:noWrap/>
+          </w:tcPr>
+          <w:p>
+            <w:pPr/>
+            <w:r>
+              <w:rPr>
+                <w:sz w:val="20"/>
+                <w:szCs w:val="20"/>
+              </w:rPr>
+              <w:t xml:space="preserve">ventas/contrato-venta</w:t>
+            </w:r>
+          </w:p>
+        </w:tc>
+        <w:tc>
+          <w:tcPr>
+            <w:tcW w:w="2800" w:type="dxa"/>
+            <w:noWrap/>
+          </w:tcPr>
+          <w:p>
+            <w:pPr/>
+            <w:r>
+              <w:rPr>
+                <w:sz w:val="20"/>
+                <w:szCs w:val="20"/>
+              </w:rPr>
+              <w:t xml:space="preserve">Administración / facturación</w:t>
+            </w:r>
+          </w:p>
+        </w:tc>
+      </w:tr>
+      <w:tr>
+        <w:trPr/>
+        <w:tc>
+          <w:tcPr>
+            <w:tcW w:w="2800" w:type="dxa"/>
+            <w:noWrap/>
+          </w:tcPr>
+          <w:p>
+            <w:pPr/>
+            <w:r>
+              <w:rPr>
+                <w:sz w:val="20"/>
+                <w:szCs w:val="20"/>
+              </w:rPr>
+              <w:t xml:space="preserve">Cola facturación abonos</w:t>
+            </w:r>
+          </w:p>
+        </w:tc>
+        <w:tc>
+          <w:tcPr>
+            <w:tcW w:w="2800" w:type="dxa"/>
+            <w:noWrap/>
+          </w:tcPr>
+          <w:p>
+            <w:pPr/>
+            <w:r>
+              <w:rPr>
+                <w:sz w:val="20"/>
+                <w:szCs w:val="20"/>
+              </w:rPr>
+              <w:t xml:space="preserve">ventas/contrato-venta-cola</w:t>
+            </w:r>
+          </w:p>
+        </w:tc>
+        <w:tc>
+          <w:tcPr>
+            <w:tcW w:w="2800" w:type="dxa"/>
+            <w:noWrap/>
+          </w:tcPr>
+          <w:p>
+            <w:pPr/>
+            <w:r>
+              <w:rPr>
+                <w:sz w:val="20"/>
+                <w:szCs w:val="20"/>
+              </w:rPr>
+              <w:t xml:space="preserve">Administración / facturación</w:t>
+            </w:r>
+          </w:p>
+        </w:tc>
+      </w:tr>
+      <w:tr>
+        <w:trPr/>
+        <w:tc>
+          <w:tcPr>
+            <w:tcW w:w="2800" w:type="dxa"/>
+            <w:noWrap/>
+          </w:tcPr>
+          <w:p>
+            <w:pPr/>
+            <w:r>
+              <w:rPr>
+                <w:sz w:val="20"/>
+                <w:szCs w:val="20"/>
+              </w:rPr>
+              <w:t xml:space="preserve">Manual en línea</w:t>
+            </w:r>
+          </w:p>
+        </w:tc>
+        <w:tc>
+          <w:tcPr>
+            <w:tcW w:w="2800" w:type="dxa"/>
+            <w:noWrap/>
+          </w:tcPr>
+          <w:p>
+            <w:pPr/>
+            <w:r>
+              <w:rPr>
+                <w:sz w:val="20"/>
+                <w:szCs w:val="20"/>
+              </w:rPr>
+              <w:t xml:space="preserve">ventas/manual</w:t>
+            </w:r>
+          </w:p>
+        </w:tc>
+        <w:tc>
+          <w:tcPr>
+            <w:tcW w:w="2800" w:type="dxa"/>
+            <w:noWrap/>
+          </w:tcPr>
+          <w:p>
+            <w:pPr/>
+            <w:r>
+              <w:rPr>
+                <w:sz w:val="20"/>
+                <w:szCs w:val="20"/>
+              </w:rPr>
+              <w:t xml:space="preserve">Todos con acceso a Ventas</w:t>
             </w:r>
           </w:p>
         </w:tc>
@@ -2382,6 +2694,73 @@
           </w:p>
         </w:tc>
       </w:tr>
+      <w:tr>
+        <w:trPr/>
+        <w:tc>
+          <w:tcPr>
+            <w:tcW w:w="2800" w:type="dxa"/>
+            <w:noWrap/>
+          </w:tcPr>
+          <w:p>
+            <w:pPr/>
+            <w:r>
+              <w:rPr>
+                <w:sz w:val="20"/>
+                <w:szCs w:val="20"/>
+              </w:rPr>
+              <w:t xml:space="preserve">Facturar reparto</w:t>
+            </w:r>
+          </w:p>
+        </w:tc>
+        <w:tc>
+          <w:tcPr>
+            <w:tcW w:w="2800" w:type="dxa"/>
+            <w:noWrap/>
+          </w:tcPr>
+          <w:p>
+            <w:pPr/>
+            <w:r>
+              <w:rPr>
+                <w:sz w:val="20"/>
+                <w:szCs w:val="20"/>
+              </w:rPr>
+              <w:t xml:space="preserve">Corte amarillo de reparto</w:t>
+            </w:r>
+          </w:p>
+        </w:tc>
+        <w:tc>
+          <w:tcPr>
+            <w:tcW w:w="2800" w:type="dxa"/>
+            <w:noWrap/>
+          </w:tcPr>
+          <w:p>
+            <w:pPr/>
+            <w:r>
+              <w:rPr>
+                <w:sz w:val="20"/>
+                <w:szCs w:val="20"/>
+              </w:rPr>
+              <w:t xml:space="preserve">Factura todos los pedidos pesados del reparto e imprime el lote.</w:t>
+            </w:r>
+          </w:p>
+        </w:tc>
+        <w:tc>
+          <w:tcPr>
+            <w:tcW w:w="2800" w:type="dxa"/>
+            <w:noWrap/>
+          </w:tcPr>
+          <w:p>
+            <w:pPr/>
+            <w:r>
+              <w:rPr>
+                <w:sz w:val="20"/>
+                <w:szCs w:val="20"/>
+              </w:rPr>
+              <w:t xml:space="preserve">facturar-reparto-pedidos</w:t>
+            </w:r>
+          </w:p>
+        </w:tc>
+      </w:tr>
     </w:tbl>
     <w:p/>
     <w:p>
@@ -4571,7 +4950,7 @@
                 <w:sz w:val="20"/>
                 <w:szCs w:val="20"/>
               </w:rPr>
-              <w:t xml:space="preserve">Se precarga con total de cajas; obligatorio (entre 1 y 999999).</w:t>
+              <w:t xml:space="preserve">Entero, no obligatorio. En pedidos importados de Anita se precarga con las cajas reales de la cabecera (penm_caja_reales).</w:t>
             </w:r>
           </w:p>
         </w:tc>
@@ -5278,7 +5657,7 @@
           <w:i w:val="1"/>
           <w:iCs w:val="1"/>
         </w:rPr>
-        <w:t xml:space="preserve">Permisos frecuentes</w:t>
+        <w:t xml:space="preserve">Permisos — pedidos y facturación</w:t>
       </w:r>
     </w:p>
     <w:tbl>
@@ -5630,41 +6009,6 @@
     </w:tbl>
     <w:p/>
     <w:p>
-      <w:pPr>
-        <w:pStyle w:val="Heading2"/>
-      </w:pPr>
-      <w:bookmarkStart w:id="13" w:name="_Toc13"/>
-      <w:r>
-        <w:t>13. Errores frecuentes y buenas prácticas</w:t>
-      </w:r>
-      <w:bookmarkEnd w:id="13"/>
-    </w:p>
-    <w:p>
-      <w:pPr>
-        <w:numPr>
-          <w:ilvl w:val="0"/>
-          <w:numId w:val=""/>
-        </w:numPr>
-      </w:pPr>
-      <w:r>
-        <w:rPr/>
-        <w:t xml:space="preserve">Buenas prácticas — vendedor remoto: cargar reparto y lugar de entrega correctos; usar UMD coherente; dejar pesada en cero; usar leyendas para observaciones; confirmar que el pedido aparece Pendiente tras guardar.</w:t>
-      </w:r>
-    </w:p>
-    <w:p>
-      <w:pPr>
-        <w:numPr>
-          <w:ilvl w:val="0"/>
-          <w:numId w:val=""/>
-        </w:numPr>
-      </w:pPr>
-      <w:r>
-        <w:rPr/>
-        <w:t xml:space="preserve">Buenas prácticas — planta: imprimir listado al recibir pedidos del día; pesar todas las cajas antes de facturar; verificar Total pesados; facturar el mismo día del despacho cuando sea posible.</w:t>
-      </w:r>
-    </w:p>
-    <w:p/>
-    <w:p>
       <w:pPr/>
       <w:r>
         <w:rPr>
@@ -5674,7 +6018,7 @@
           <w:i w:val="1"/>
           <w:iCs w:val="1"/>
         </w:rPr>
-        <w:t xml:space="preserve">Problema → solución</w:t>
+        <w:t xml:space="preserve">Permisos — módulo Abonos</w:t>
       </w:r>
     </w:p>
     <w:tbl>
@@ -5718,7 +6062,7 @@
                 <w:b w:val="1"/>
                 <w:bCs w:val="1"/>
               </w:rPr>
-              <w:t xml:space="preserve">Situación</w:t>
+              <w:t xml:space="preserve">Permiso</w:t>
             </w:r>
           </w:p>
         </w:tc>
@@ -5738,6 +6082,344 @@
                 <w:b w:val="1"/>
                 <w:bCs w:val="1"/>
               </w:rPr>
+              <w:t xml:space="preserve">Uso</w:t>
+            </w:r>
+          </w:p>
+        </w:tc>
+      </w:tr>
+      <w:tr>
+        <w:trPr/>
+        <w:tc>
+          <w:tcPr>
+            <w:tcW w:w="2800" w:type="dxa"/>
+            <w:noWrap/>
+          </w:tcPr>
+          <w:p>
+            <w:pPr/>
+            <w:r>
+              <w:rPr>
+                <w:sz w:val="20"/>
+                <w:szCs w:val="20"/>
+              </w:rPr>
+              <w:t xml:space="preserve">listar-conceptos-venta</w:t>
+            </w:r>
+          </w:p>
+        </w:tc>
+        <w:tc>
+          <w:tcPr>
+            <w:tcW w:w="2800" w:type="dxa"/>
+            <w:noWrap/>
+          </w:tcPr>
+          <w:p>
+            <w:pPr/>
+            <w:r>
+              <w:rPr>
+                <w:sz w:val="20"/>
+                <w:szCs w:val="20"/>
+              </w:rPr>
+              <w:t xml:space="preserve">Ver y consultar conceptos de venta</w:t>
+            </w:r>
+          </w:p>
+        </w:tc>
+      </w:tr>
+      <w:tr>
+        <w:trPr/>
+        <w:tc>
+          <w:tcPr>
+            <w:tcW w:w="2800" w:type="dxa"/>
+            <w:noWrap/>
+          </w:tcPr>
+          <w:p>
+            <w:pPr/>
+            <w:r>
+              <w:rPr>
+                <w:sz w:val="20"/>
+                <w:szCs w:val="20"/>
+              </w:rPr>
+              <w:t xml:space="preserve">crear-conceptos-venta / editar-conceptos-venta / actualizar-conceptos-venta / borrar-conceptos-venta</w:t>
+            </w:r>
+          </w:p>
+        </w:tc>
+        <w:tc>
+          <w:tcPr>
+            <w:tcW w:w="2800" w:type="dxa"/>
+            <w:noWrap/>
+          </w:tcPr>
+          <w:p>
+            <w:pPr/>
+            <w:r>
+              <w:rPr>
+                <w:sz w:val="20"/>
+                <w:szCs w:val="20"/>
+              </w:rPr>
+              <w:t xml:space="preserve">ABM de conceptos y tags</w:t>
+            </w:r>
+          </w:p>
+        </w:tc>
+      </w:tr>
+      <w:tr>
+        <w:trPr/>
+        <w:tc>
+          <w:tcPr>
+            <w:tcW w:w="2800" w:type="dxa"/>
+            <w:noWrap/>
+          </w:tcPr>
+          <w:p>
+            <w:pPr/>
+            <w:r>
+              <w:rPr>
+                <w:sz w:val="20"/>
+                <w:szCs w:val="20"/>
+              </w:rPr>
+              <w:t xml:space="preserve">listar-contratos-venta</w:t>
+            </w:r>
+          </w:p>
+        </w:tc>
+        <w:tc>
+          <w:tcPr>
+            <w:tcW w:w="2800" w:type="dxa"/>
+            <w:noWrap/>
+          </w:tcPr>
+          <w:p>
+            <w:pPr/>
+            <w:r>
+              <w:rPr>
+                <w:sz w:val="20"/>
+                <w:szCs w:val="20"/>
+              </w:rPr>
+              <w:t xml:space="preserve">Ver abonos / contratos</w:t>
+            </w:r>
+          </w:p>
+        </w:tc>
+      </w:tr>
+      <w:tr>
+        <w:trPr/>
+        <w:tc>
+          <w:tcPr>
+            <w:tcW w:w="2800" w:type="dxa"/>
+            <w:noWrap/>
+          </w:tcPr>
+          <w:p>
+            <w:pPr/>
+            <w:r>
+              <w:rPr>
+                <w:sz w:val="20"/>
+                <w:szCs w:val="20"/>
+              </w:rPr>
+              <w:t xml:space="preserve">crear-contratos-venta / editar-contratos-venta / actualizar-contratos-venta / borrar-contratos-venta</w:t>
+            </w:r>
+          </w:p>
+        </w:tc>
+        <w:tc>
+          <w:tcPr>
+            <w:tcW w:w="2800" w:type="dxa"/>
+            <w:noWrap/>
+          </w:tcPr>
+          <w:p>
+            <w:pPr/>
+            <w:r>
+              <w:rPr>
+                <w:sz w:val="20"/>
+                <w:szCs w:val="20"/>
+              </w:rPr>
+              <w:t xml:space="preserve">ABM de abonos</w:t>
+            </w:r>
+          </w:p>
+        </w:tc>
+      </w:tr>
+      <w:tr>
+        <w:trPr/>
+        <w:tc>
+          <w:tcPr>
+            <w:tcW w:w="2800" w:type="dxa"/>
+            <w:noWrap/>
+          </w:tcPr>
+          <w:p>
+            <w:pPr/>
+            <w:r>
+              <w:rPr>
+                <w:sz w:val="20"/>
+                <w:szCs w:val="20"/>
+              </w:rPr>
+              <w:t xml:space="preserve">listar-contrato-venta-cola</w:t>
+            </w:r>
+          </w:p>
+        </w:tc>
+        <w:tc>
+          <w:tcPr>
+            <w:tcW w:w="2800" w:type="dxa"/>
+            <w:noWrap/>
+          </w:tcPr>
+          <w:p>
+            <w:pPr/>
+            <w:r>
+              <w:rPr>
+                <w:sz w:val="20"/>
+                <w:szCs w:val="20"/>
+              </w:rPr>
+              <w:t xml:space="preserve">Ver cola de períodos a facturar</w:t>
+            </w:r>
+          </w:p>
+        </w:tc>
+      </w:tr>
+      <w:tr>
+        <w:trPr/>
+        <w:tc>
+          <w:tcPr>
+            <w:tcW w:w="2800" w:type="dxa"/>
+            <w:noWrap/>
+          </w:tcPr>
+          <w:p>
+            <w:pPr/>
+            <w:r>
+              <w:rPr>
+                <w:sz w:val="20"/>
+                <w:szCs w:val="20"/>
+              </w:rPr>
+              <w:t xml:space="preserve">facturar-contrato-venta-cola</w:t>
+            </w:r>
+          </w:p>
+        </w:tc>
+        <w:tc>
+          <w:tcPr>
+            <w:tcW w:w="2800" w:type="dxa"/>
+            <w:noWrap/>
+          </w:tcPr>
+          <w:p>
+            <w:pPr/>
+            <w:r>
+              <w:rPr>
+                <w:sz w:val="20"/>
+                <w:szCs w:val="20"/>
+              </w:rPr>
+              <w:t xml:space="preserve">Enviar abonos de la cola al facturador</w:t>
+            </w:r>
+          </w:p>
+        </w:tc>
+      </w:tr>
+    </w:tbl>
+    <w:p/>
+    <w:p>
+      <w:pPr>
+        <w:pStyle w:val="Heading2"/>
+      </w:pPr>
+      <w:bookmarkStart w:id="13" w:name="_Toc13"/>
+      <w:r>
+        <w:t>13. Errores frecuentes y buenas prácticas</w:t>
+      </w:r>
+      <w:bookmarkEnd w:id="13"/>
+    </w:p>
+    <w:p>
+      <w:pPr>
+        <w:numPr>
+          <w:ilvl w:val="0"/>
+          <w:numId w:val=""/>
+        </w:numPr>
+      </w:pPr>
+      <w:r>
+        <w:rPr/>
+        <w:t xml:space="preserve">Buenas prácticas — vendedor remoto: cargar reparto y lugar de entrega correctos; usar UMD coherente; dejar pesada en cero; usar leyendas para observaciones; confirmar que el pedido aparece Pendiente tras guardar.</w:t>
+      </w:r>
+    </w:p>
+    <w:p>
+      <w:pPr>
+        <w:numPr>
+          <w:ilvl w:val="0"/>
+          <w:numId w:val=""/>
+        </w:numPr>
+      </w:pPr>
+      <w:r>
+        <w:rPr/>
+        <w:t xml:space="preserve">Buenas prácticas — planta: imprimir listado al recibir pedidos del día; pesar todas las cajas antes de facturar; verificar Total pesados; facturar el mismo día del despacho cuando sea posible.</w:t>
+      </w:r>
+    </w:p>
+    <w:p>
+      <w:pPr>
+        <w:numPr>
+          <w:ilvl w:val="0"/>
+          <w:numId w:val=""/>
+        </w:numPr>
+      </w:pPr>
+      <w:r>
+        <w:rPr/>
+        <w:t xml:space="preserve">Buenas prácticas — abonos: definir tags en el concepto antes de alta masiva de contratos; guardar datos fijos (dominio, patente) en el abono; facturar períodos desde la cola; revisar avisos de vencimiento.</w:t>
+      </w:r>
+    </w:p>
+    <w:p/>
+    <w:p>
+      <w:pPr/>
+      <w:r>
+        <w:rPr>
+          <w:color w:val="666666"/>
+          <w:sz w:val="18"/>
+          <w:szCs w:val="18"/>
+          <w:i w:val="1"/>
+          <w:iCs w:val="1"/>
+        </w:rPr>
+        <w:t xml:space="preserve">Pedidos — problema → solución</w:t>
+      </w:r>
+    </w:p>
+    <w:tbl>
+      <w:tblGrid>
+        <w:gridCol w:w="2800" w:type="dxa"/>
+        <w:gridCol w:w="2800" w:type="dxa"/>
+      </w:tblGrid>
+      <w:tblPr>
+        <w:tblW w:w="0" w:type="auto"/>
+        <w:tblLayout w:type="autofit"/>
+        <w:tblCellMar>
+          <w:top w:w="80" w:type="dxa"/>
+          <w:left w:w="80" w:type="dxa"/>
+          <w:right w:w="80" w:type="dxa"/>
+          <w:bottom w:w="80" w:type="dxa"/>
+        </w:tblCellMar>
+        <w:tblBorders>
+          <w:top w:val="single" w:sz="6" w:color="AAAAAA"/>
+          <w:left w:val="single" w:sz="6" w:color="AAAAAA"/>
+          <w:right w:val="single" w:sz="6" w:color="AAAAAA"/>
+          <w:bottom w:val="single" w:sz="6" w:color="AAAAAA"/>
+          <w:insideH w:val="single" w:sz="6" w:color="AAAAAA"/>
+          <w:insideV w:val="single" w:sz="6" w:color="AAAAAA"/>
+        </w:tblBorders>
+      </w:tblPr>
+      <w:tr>
+        <w:trPr/>
+        <w:tc>
+          <w:tcPr>
+            <w:tcW w:w="2800" w:type="dxa"/>
+            <w:shd w:val="clear" w:fill="2E75B6"/>
+            <w:noWrap/>
+          </w:tcPr>
+          <w:p>
+            <w:pPr/>
+            <w:r>
+              <w:rPr>
+                <w:color w:val="FFFFFF"/>
+                <w:sz w:val="20"/>
+                <w:szCs w:val="20"/>
+                <w:b w:val="1"/>
+                <w:bCs w:val="1"/>
+              </w:rPr>
+              <w:t xml:space="preserve">Situación</w:t>
+            </w:r>
+          </w:p>
+        </w:tc>
+        <w:tc>
+          <w:tcPr>
+            <w:tcW w:w="2800" w:type="dxa"/>
+            <w:shd w:val="clear" w:fill="2E75B6"/>
+            <w:noWrap/>
+          </w:tcPr>
+          <w:p>
+            <w:pPr/>
+            <w:r>
+              <w:rPr>
+                <w:color w:val="FFFFFF"/>
+                <w:sz w:val="20"/>
+                <w:szCs w:val="20"/>
+                <w:b w:val="1"/>
+                <w:bCs w:val="1"/>
+              </w:rPr>
               <w:t xml:space="preserve">Qué hacer</w:t>
             </w:r>
           </w:p>
@@ -5932,23 +6614,23 @@
                 <w:sz w:val="20"/>
                 <w:szCs w:val="20"/>
               </w:rPr>
-              <w:t xml:space="preserve">No factura sin bultos</w:t>
-            </w:r>
-          </w:p>
-        </w:tc>
-        <w:tc>
-          <w:tcPr>
-            <w:tcW w:w="2800" w:type="dxa"/>
-            <w:noWrap/>
-          </w:tcPr>
-          <w:p>
-            <w:pPr/>
-            <w:r>
-              <w:rPr>
-                <w:sz w:val="20"/>
-                <w:szCs w:val="20"/>
-              </w:rPr>
-              <w:t xml:space="preserve">Indique cantidad de bultos ≥ 1 en el modal (normalmente = total cajas).</w:t>
+              <w:t xml:space="preserve">Bultos con decimales</w:t>
+            </w:r>
+          </w:p>
+        </w:tc>
+        <w:tc>
+          <w:tcPr>
+            <w:tcW w:w="2800" w:type="dxa"/>
+            <w:noWrap/>
+          </w:tcPr>
+          <w:p>
+            <w:pPr/>
+            <w:r>
+              <w:rPr>
+                <w:sz w:val="20"/>
+                <w:szCs w:val="20"/>
+              </w:rPr>
+              <w:t xml:space="preserve">La cantidad de bultos es entera; si quedó un decimal, bórrelo. El campo no es obligatorio.</w:t>
             </w:r>
           </w:p>
         </w:tc>
@@ -6019,6 +6701,3391 @@
                 <w:szCs w:val="20"/>
               </w:rPr>
               <w:t xml:space="preserve">Configure salida en el listado (impresora/comando del usuario).</w:t>
+            </w:r>
+          </w:p>
+        </w:tc>
+      </w:tr>
+    </w:tbl>
+    <w:p/>
+    <w:p>
+      <w:pPr/>
+      <w:r>
+        <w:rPr>
+          <w:color w:val="666666"/>
+          <w:sz w:val="18"/>
+          <w:szCs w:val="18"/>
+          <w:i w:val="1"/>
+          <w:iCs w:val="1"/>
+        </w:rPr>
+        <w:t xml:space="preserve">Abonos — problema → solución</w:t>
+      </w:r>
+    </w:p>
+    <w:tbl>
+      <w:tblGrid>
+        <w:gridCol w:w="2800" w:type="dxa"/>
+        <w:gridCol w:w="2800" w:type="dxa"/>
+      </w:tblGrid>
+      <w:tblPr>
+        <w:tblW w:w="0" w:type="auto"/>
+        <w:tblLayout w:type="autofit"/>
+        <w:tblCellMar>
+          <w:top w:w="80" w:type="dxa"/>
+          <w:left w:w="80" w:type="dxa"/>
+          <w:right w:w="80" w:type="dxa"/>
+          <w:bottom w:w="80" w:type="dxa"/>
+        </w:tblCellMar>
+        <w:tblBorders>
+          <w:top w:val="single" w:sz="6" w:color="AAAAAA"/>
+          <w:left w:val="single" w:sz="6" w:color="AAAAAA"/>
+          <w:right w:val="single" w:sz="6" w:color="AAAAAA"/>
+          <w:bottom w:val="single" w:sz="6" w:color="AAAAAA"/>
+          <w:insideH w:val="single" w:sz="6" w:color="AAAAAA"/>
+          <w:insideV w:val="single" w:sz="6" w:color="AAAAAA"/>
+        </w:tblBorders>
+      </w:tblPr>
+      <w:tr>
+        <w:trPr/>
+        <w:tc>
+          <w:tcPr>
+            <w:tcW w:w="2800" w:type="dxa"/>
+            <w:shd w:val="clear" w:fill="2E75B6"/>
+            <w:noWrap/>
+          </w:tcPr>
+          <w:p>
+            <w:pPr/>
+            <w:r>
+              <w:rPr>
+                <w:color w:val="FFFFFF"/>
+                <w:sz w:val="20"/>
+                <w:szCs w:val="20"/>
+                <w:b w:val="1"/>
+                <w:bCs w:val="1"/>
+              </w:rPr>
+              <w:t xml:space="preserve">Situación</w:t>
+            </w:r>
+          </w:p>
+        </w:tc>
+        <w:tc>
+          <w:tcPr>
+            <w:tcW w:w="2800" w:type="dxa"/>
+            <w:shd w:val="clear" w:fill="2E75B6"/>
+            <w:noWrap/>
+          </w:tcPr>
+          <w:p>
+            <w:pPr/>
+            <w:r>
+              <w:rPr>
+                <w:color w:val="FFFFFF"/>
+                <w:sz w:val="20"/>
+                <w:szCs w:val="20"/>
+                <w:b w:val="1"/>
+                <w:bCs w:val="1"/>
+              </w:rPr>
+              <w:t xml:space="preserve">Qué hacer</w:t>
+            </w:r>
+          </w:p>
+        </w:tc>
+      </w:tr>
+      <w:tr>
+        <w:trPr/>
+        <w:tc>
+          <w:tcPr>
+            <w:tcW w:w="2800" w:type="dxa"/>
+            <w:noWrap/>
+          </w:tcPr>
+          <w:p>
+            <w:pPr/>
+            <w:r>
+              <w:rPr>
+                <w:sz w:val="20"/>
+                <w:szCs w:val="20"/>
+              </w:rPr>
+              <w:t xml:space="preserve">El sistema rechaza tags sin resolver (@clave@)</w:t>
+            </w:r>
+          </w:p>
+        </w:tc>
+        <w:tc>
+          <w:tcPr>
+            <w:tcW w:w="2800" w:type="dxa"/>
+            <w:noWrap/>
+          </w:tcPr>
+          <w:p>
+            <w:pPr/>
+            <w:r>
+              <w:rPr>
+                <w:sz w:val="20"/>
+                <w:szCs w:val="20"/>
+              </w:rPr>
+              <w:t xml:space="preserve">Complete el modal de tags o cargue datos fijos en el abono; no deje placeholders en la descripción final.</w:t>
+            </w:r>
+          </w:p>
+        </w:tc>
+      </w:tr>
+      <w:tr>
+        <w:trPr/>
+        <w:tc>
+          <w:tcPr>
+            <w:tcW w:w="2800" w:type="dxa"/>
+            <w:noWrap/>
+          </w:tcPr>
+          <w:p>
+            <w:pPr/>
+            <w:r>
+              <w:rPr>
+                <w:sz w:val="20"/>
+                <w:szCs w:val="20"/>
+              </w:rPr>
+              <w:t xml:space="preserve">No aparece el abono en la cola</w:t>
+            </w:r>
+          </w:p>
+        </w:tc>
+        <w:tc>
+          <w:tcPr>
+            <w:tcW w:w="2800" w:type="dxa"/>
+            <w:noWrap/>
+          </w:tcPr>
+          <w:p>
+            <w:pPr/>
+            <w:r>
+              <w:rPr>
+                <w:sz w:val="20"/>
+                <w:szCs w:val="20"/>
+              </w:rPr>
+              <w:t xml:space="preserve">Verifique estado Activo, vigencia, periodicidad y que el período aún no esté marcado como facturado.</w:t>
+            </w:r>
+          </w:p>
+        </w:tc>
+      </w:tr>
+      <w:tr>
+        <w:trPr/>
+        <w:tc>
+          <w:tcPr>
+            <w:tcW w:w="2800" w:type="dxa"/>
+            <w:noWrap/>
+          </w:tcPr>
+          <w:p>
+            <w:pPr/>
+            <w:r>
+              <w:rPr>
+                <w:sz w:val="20"/>
+                <w:szCs w:val="20"/>
+              </w:rPr>
+              <w:t xml:space="preserve">El período se factura dos veces</w:t>
+            </w:r>
+          </w:p>
+        </w:tc>
+        <w:tc>
+          <w:tcPr>
+            <w:tcW w:w="2800" w:type="dxa"/>
+            <w:noWrap/>
+          </w:tcPr>
+          <w:p>
+            <w:pPr/>
+            <w:r>
+              <w:rPr>
+                <w:sz w:val="20"/>
+                <w:szCs w:val="20"/>
+              </w:rPr>
+              <w:t xml:space="preserve">La cola solo muestra períodos pendientes; si ya facturó fuera de la cola, marque el período o revise el historial del abono.</w:t>
+            </w:r>
+          </w:p>
+        </w:tc>
+      </w:tr>
+      <w:tr>
+        <w:trPr/>
+        <w:tc>
+          <w:tcPr>
+            <w:tcW w:w="2800" w:type="dxa"/>
+            <w:noWrap/>
+          </w:tcPr>
+          <w:p>
+            <w:pPr/>
+            <w:r>
+              <w:rPr>
+                <w:sz w:val="20"/>
+                <w:szCs w:val="20"/>
+              </w:rPr>
+              <w:t xml:space="preserve">Condicional no se ve en la factura</w:t>
+            </w:r>
+          </w:p>
+        </w:tc>
+        <w:tc>
+          <w:tcPr>
+            <w:tcW w:w="2800" w:type="dxa"/>
+            <w:noWrap/>
+          </w:tcPr>
+          <w:p>
+            <w:pPr/>
+            <w:r>
+              <w:rPr>
+                <w:sz w:val="20"/>
+                <w:szCs w:val="20"/>
+              </w:rPr>
+              <w:t xml:space="preserve">Revise la clave y el valor: {{#si dominio}}…{{/si}} o {{#si dominio=AB123CD}}…{{/si}}.</w:t>
+            </w:r>
+          </w:p>
+        </w:tc>
+      </w:tr>
+      <w:tr>
+        <w:trPr/>
+        <w:tc>
+          <w:tcPr>
+            <w:tcW w:w="2800" w:type="dxa"/>
+            <w:noWrap/>
+          </w:tcPr>
+          <w:p>
+            <w:pPr/>
+            <w:r>
+              <w:rPr>
+                <w:sz w:val="20"/>
+                <w:szCs w:val="20"/>
+              </w:rPr>
+              <w:t xml:space="preserve">Descripción truncada en ARCA</w:t>
+            </w:r>
+          </w:p>
+        </w:tc>
+        <w:tc>
+          <w:tcPr>
+            <w:tcW w:w="2800" w:type="dxa"/>
+            <w:noWrap/>
+          </w:tcPr>
+          <w:p>
+            <w:pPr/>
+            <w:r>
+              <w:rPr>
+                <w:sz w:val="20"/>
+                <w:szCs w:val="20"/>
+              </w:rPr>
+              <w:t xml:space="preserve">El detalle fiscal tiene límite de caracteres; acorte la plantilla o los valores de tags.</w:t>
+            </w:r>
+          </w:p>
+        </w:tc>
+      </w:tr>
+      <w:tr>
+        <w:trPr/>
+        <w:tc>
+          <w:tcPr>
+            <w:tcW w:w="2800" w:type="dxa"/>
+            <w:noWrap/>
+          </w:tcPr>
+          <w:p>
+            <w:pPr/>
+            <w:r>
+              <w:rPr>
+                <w:sz w:val="20"/>
+                <w:szCs w:val="20"/>
+              </w:rPr>
+              <w:t xml:space="preserve">No ve el menú Abonos</w:t>
+            </w:r>
+          </w:p>
+        </w:tc>
+        <w:tc>
+          <w:tcPr>
+            <w:tcW w:w="2800" w:type="dxa"/>
+            <w:noWrap/>
+          </w:tcPr>
+          <w:p>
+            <w:pPr/>
+            <w:r>
+              <w:rPr>
+                <w:sz w:val="20"/>
+                <w:szCs w:val="20"/>
+              </w:rPr>
+              <w:t xml:space="preserve">Pida a un administrador el menú Ventas → Abonos y los permisos de conceptos/contratos/cola.</w:t>
+            </w:r>
+          </w:p>
+        </w:tc>
+      </w:tr>
+    </w:tbl>
+    <w:p/>
+    <w:p>
+      <w:pPr>
+        <w:pStyle w:val="Heading2"/>
+      </w:pPr>
+      <w:bookmarkStart w:id="14" w:name="_Toc14"/>
+      <w:r>
+        <w:t>14. Módulo Abonos — visión general</w:t>
+      </w:r>
+      <w:bookmarkEnd w:id="14"/>
+    </w:p>
+    <w:p>
+      <w:pPr>
+        <w:jc w:val="both"/>
+        <w:spacing w:after="120"/>
+      </w:pPr>
+      <w:r>
+        <w:rPr>
+          <w:sz w:val="22"/>
+          <w:szCs w:val="22"/>
+        </w:rPr>
+        <w:t xml:space="preserve">El módulo Abonos vive bajo Ventas (no bajo Tablas de ventas). Une tres pantallas: Conceptos de venta (qué se factura y cómo se describe), Abonos / contratos (a quién y con qué datos fijos) y Cola de facturación (qué períodos faltan emitir).</w:t>
+      </w:r>
+    </w:p>
+    <w:p>
+      <w:pPr>
+        <w:jc w:val="both"/>
+        <w:spacing w:after="120"/>
+      </w:pPr>
+      <w:r>
+        <w:rPr>
+          <w:sz w:val="22"/>
+          <w:szCs w:val="22"/>
+        </w:rPr>
+        <w:t xml:space="preserve">Flujo recomendado: 1) crear o ajustar el concepto con plantilla y tags; 2) dar de alta el abono del cliente; 3) facturar el período desde la cola o el facturador; 4) el sistema deja histórico del período y guarda los valores de tags usados en la emisión.</w:t>
+      </w:r>
+    </w:p>
+    <w:p>
+      <w:pPr>
+        <w:jc w:val="both"/>
+        <w:spacing w:after="120"/>
+      </w:pPr>
+      <w:r>
+        <w:rPr>
+          <w:sz w:val="22"/>
+          <w:szCs w:val="22"/>
+          <w:i w:val="1"/>
+          <w:iCs w:val="1"/>
+        </w:rPr>
+        <w:t xml:space="preserve">La facturación fiscal sigue siendo el mismo circuito de Ventas (punto de venta, ARCA, PDF). El módulo Abonos prepara el renglón (cliente, concepto, descripción y período) para no reescribir a mano cada mes.</w:t>
+      </w:r>
+    </w:p>
+    <w:p>
+      <w:pPr>
+        <w:spacing w:after="120"/>
+      </w:pPr>
+      <w:r>
+        <w:rPr>
+          <w:rFonts w:ascii="Courier New" w:hAnsi="Courier New" w:eastAsia="Courier New" w:cs="Courier New"/>
+          <w:sz w:val="18"/>
+          <w:szCs w:val="18"/>
+        </w:rPr>
+        <w:t xml:space="preserve">1. CONCEPTO DE VENTA ──► Plantilla + tags + condicionales + precio / IVA / cuenta
+         │
+         ▼
+2. ABONO / CONTRATO ──► Cliente + concepto + vigencia + periodicidad + datos fijos
+         │
+         ▼
+3. COLA / FACTURADOR ──► Completa tags pedibles (si faltan) → emite ARCA
+         │
+         ▼
+4. HISTÓRICO ──► Período marcado facturado + valores de tags en la emisión
+         │
+         ▼
+5. AVISOS ──► Cron diario de vencimiento (emails configurados)</w:t>
+      </w:r>
+    </w:p>
+    <w:p>
+      <w:pPr/>
+      <w:r>
+        <w:rPr>
+          <w:color w:val="666666"/>
+          <w:sz w:val="18"/>
+          <w:szCs w:val="18"/>
+          <w:i w:val="1"/>
+          <w:iCs w:val="1"/>
+        </w:rPr>
+        <w:t xml:space="preserve">Menú Ventas → Abonos</w:t>
+      </w:r>
+    </w:p>
+    <w:tbl>
+      <w:tblGrid>
+        <w:gridCol w:w="2800" w:type="dxa"/>
+        <w:gridCol w:w="2800" w:type="dxa"/>
+        <w:gridCol w:w="2800" w:type="dxa"/>
+      </w:tblGrid>
+      <w:tblPr>
+        <w:tblW w:w="0" w:type="auto"/>
+        <w:tblLayout w:type="autofit"/>
+        <w:tblCellMar>
+          <w:top w:w="80" w:type="dxa"/>
+          <w:left w:w="80" w:type="dxa"/>
+          <w:right w:w="80" w:type="dxa"/>
+          <w:bottom w:w="80" w:type="dxa"/>
+        </w:tblCellMar>
+        <w:tblBorders>
+          <w:top w:val="single" w:sz="6" w:color="AAAAAA"/>
+          <w:left w:val="single" w:sz="6" w:color="AAAAAA"/>
+          <w:right w:val="single" w:sz="6" w:color="AAAAAA"/>
+          <w:bottom w:val="single" w:sz="6" w:color="AAAAAA"/>
+          <w:insideH w:val="single" w:sz="6" w:color="AAAAAA"/>
+          <w:insideV w:val="single" w:sz="6" w:color="AAAAAA"/>
+        </w:tblBorders>
+      </w:tblPr>
+      <w:tr>
+        <w:trPr/>
+        <w:tc>
+          <w:tcPr>
+            <w:tcW w:w="2800" w:type="dxa"/>
+            <w:shd w:val="clear" w:fill="2E75B6"/>
+            <w:noWrap/>
+          </w:tcPr>
+          <w:p>
+            <w:pPr/>
+            <w:r>
+              <w:rPr>
+                <w:color w:val="FFFFFF"/>
+                <w:sz w:val="20"/>
+                <w:szCs w:val="20"/>
+                <w:b w:val="1"/>
+                <w:bCs w:val="1"/>
+              </w:rPr>
+              <w:t xml:space="preserve">Opción</w:t>
+            </w:r>
+          </w:p>
+        </w:tc>
+        <w:tc>
+          <w:tcPr>
+            <w:tcW w:w="2800" w:type="dxa"/>
+            <w:shd w:val="clear" w:fill="2E75B6"/>
+            <w:noWrap/>
+          </w:tcPr>
+          <w:p>
+            <w:pPr/>
+            <w:r>
+              <w:rPr>
+                <w:color w:val="FFFFFF"/>
+                <w:sz w:val="20"/>
+                <w:szCs w:val="20"/>
+                <w:b w:val="1"/>
+                <w:bCs w:val="1"/>
+              </w:rPr>
+              <w:t xml:space="preserve">Ruta</w:t>
+            </w:r>
+          </w:p>
+        </w:tc>
+        <w:tc>
+          <w:tcPr>
+            <w:tcW w:w="2800" w:type="dxa"/>
+            <w:shd w:val="clear" w:fill="2E75B6"/>
+            <w:noWrap/>
+          </w:tcPr>
+          <w:p>
+            <w:pPr/>
+            <w:r>
+              <w:rPr>
+                <w:color w:val="FFFFFF"/>
+                <w:sz w:val="20"/>
+                <w:szCs w:val="20"/>
+                <w:b w:val="1"/>
+                <w:bCs w:val="1"/>
+              </w:rPr>
+              <w:t xml:space="preserve">Para qué</w:t>
+            </w:r>
+          </w:p>
+        </w:tc>
+      </w:tr>
+      <w:tr>
+        <w:trPr/>
+        <w:tc>
+          <w:tcPr>
+            <w:tcW w:w="2800" w:type="dxa"/>
+            <w:noWrap/>
+          </w:tcPr>
+          <w:p>
+            <w:pPr/>
+            <w:r>
+              <w:rPr>
+                <w:sz w:val="20"/>
+                <w:szCs w:val="20"/>
+              </w:rPr>
+              <w:t xml:space="preserve">Abonos / contratos</w:t>
+            </w:r>
+          </w:p>
+        </w:tc>
+        <w:tc>
+          <w:tcPr>
+            <w:tcW w:w="2800" w:type="dxa"/>
+            <w:noWrap/>
+          </w:tcPr>
+          <w:p>
+            <w:pPr/>
+            <w:r>
+              <w:rPr>
+                <w:sz w:val="20"/>
+                <w:szCs w:val="20"/>
+              </w:rPr>
+              <w:t xml:space="preserve">ventas/contrato-venta</w:t>
+            </w:r>
+          </w:p>
+        </w:tc>
+        <w:tc>
+          <w:tcPr>
+            <w:tcW w:w="2800" w:type="dxa"/>
+            <w:noWrap/>
+          </w:tcPr>
+          <w:p>
+            <w:pPr/>
+            <w:r>
+              <w:rPr>
+                <w:sz w:val="20"/>
+                <w:szCs w:val="20"/>
+              </w:rPr>
+              <w:t xml:space="preserve">Alta y mantenimiento de contratos de servicio</w:t>
+            </w:r>
+          </w:p>
+        </w:tc>
+      </w:tr>
+      <w:tr>
+        <w:trPr/>
+        <w:tc>
+          <w:tcPr>
+            <w:tcW w:w="2800" w:type="dxa"/>
+            <w:noWrap/>
+          </w:tcPr>
+          <w:p>
+            <w:pPr/>
+            <w:r>
+              <w:rPr>
+                <w:sz w:val="20"/>
+                <w:szCs w:val="20"/>
+              </w:rPr>
+              <w:t xml:space="preserve">Cola facturación abonos</w:t>
+            </w:r>
+          </w:p>
+        </w:tc>
+        <w:tc>
+          <w:tcPr>
+            <w:tcW w:w="2800" w:type="dxa"/>
+            <w:noWrap/>
+          </w:tcPr>
+          <w:p>
+            <w:pPr/>
+            <w:r>
+              <w:rPr>
+                <w:sz w:val="20"/>
+                <w:szCs w:val="20"/>
+              </w:rPr>
+              <w:t xml:space="preserve">ventas/contrato-venta-cola</w:t>
+            </w:r>
+          </w:p>
+        </w:tc>
+        <w:tc>
+          <w:tcPr>
+            <w:tcW w:w="2800" w:type="dxa"/>
+            <w:noWrap/>
+          </w:tcPr>
+          <w:p>
+            <w:pPr/>
+            <w:r>
+              <w:rPr>
+                <w:sz w:val="20"/>
+                <w:szCs w:val="20"/>
+              </w:rPr>
+              <w:t xml:space="preserve">Listar períodos pendientes y mandarlos a facturar</w:t>
+            </w:r>
+          </w:p>
+        </w:tc>
+      </w:tr>
+      <w:tr>
+        <w:trPr/>
+        <w:tc>
+          <w:tcPr>
+            <w:tcW w:w="2800" w:type="dxa"/>
+            <w:noWrap/>
+          </w:tcPr>
+          <w:p>
+            <w:pPr/>
+            <w:r>
+              <w:rPr>
+                <w:sz w:val="20"/>
+                <w:szCs w:val="20"/>
+              </w:rPr>
+              <w:t xml:space="preserve">Conceptos de venta</w:t>
+            </w:r>
+          </w:p>
+        </w:tc>
+        <w:tc>
+          <w:tcPr>
+            <w:tcW w:w="2800" w:type="dxa"/>
+            <w:noWrap/>
+          </w:tcPr>
+          <w:p>
+            <w:pPr/>
+            <w:r>
+              <w:rPr>
+                <w:sz w:val="20"/>
+                <w:szCs w:val="20"/>
+              </w:rPr>
+              <w:t xml:space="preserve">ventas/concepto-venta</w:t>
+            </w:r>
+          </w:p>
+        </w:tc>
+        <w:tc>
+          <w:tcPr>
+            <w:tcW w:w="2800" w:type="dxa"/>
+            <w:noWrap/>
+          </w:tcPr>
+          <w:p>
+            <w:pPr/>
+            <w:r>
+              <w:rPr>
+                <w:sz w:val="20"/>
+                <w:szCs w:val="20"/>
+              </w:rPr>
+              <w:t xml:space="preserve">Catálogo de ítems de mostrador / abono con plantillas</w:t>
+            </w:r>
+          </w:p>
+        </w:tc>
+      </w:tr>
+    </w:tbl>
+    <w:p/>
+    <w:p>
+      <w:pPr>
+        <w:pStyle w:val="Heading2"/>
+      </w:pPr>
+      <w:bookmarkStart w:id="15" w:name="_Toc15"/>
+      <w:r>
+        <w:t>15. Conceptos de venta y plantillas</w:t>
+      </w:r>
+      <w:bookmarkEnd w:id="15"/>
+    </w:p>
+    <w:p>
+      <w:pPr>
+        <w:jc w:val="both"/>
+        <w:spacing w:after="120"/>
+      </w:pPr>
+      <w:r>
+        <w:rPr>
+          <w:sz w:val="22"/>
+          <w:szCs w:val="22"/>
+        </w:rPr>
+        <w:t xml:space="preserve">Un concepto de venta es el ítem que se elige en facturación mostrador o en un abono: código, nombre, precio, alícuota, cuenta contable y descripción fiscal (texto que ve ARCA / PDF).</w:t>
+      </w:r>
+    </w:p>
+    <w:p>
+      <w:pPr>
+        <w:jc w:val="both"/>
+        <w:spacing w:after="120"/>
+      </w:pPr>
+      <w:r>
+        <w:rPr>
+          <w:sz w:val="22"/>
+          <w:szCs w:val="22"/>
+        </w:rPr>
+        <w:t xml:space="preserve">La descripción puede ser fija o una plantilla con tags @clave@ y bloques condicionales. Al facturar, el sistema reemplaza los tags por valores (modal, datos del abono o tags de sistema) y deja el texto final sin placeholders.</w:t>
+      </w:r>
+    </w:p>
+    <w:p>
+      <w:pPr>
+        <w:jc w:val="both"/>
+        <w:spacing w:after="120"/>
+      </w:pPr>
+      <w:r>
+        <w:rPr>
+          <w:sz w:val="22"/>
+          <w:szCs w:val="22"/>
+        </w:rPr>
+        <w:t xml:space="preserve">Acceso: Ventas → Abonos → Conceptos de venta (ventas/concepto-venta). En la solapa de tags del concepto se definen clave, etiqueta, tipo, origen y opciones (si es lista).</w:t>
+      </w:r>
+    </w:p>
+    <w:p>
+      <w:pPr>
+        <w:jc w:val="both"/>
+        <w:spacing w:after="120"/>
+      </w:pPr>
+      <w:r>
+        <w:rPr>
+          <w:sz w:val="22"/>
+          <w:szCs w:val="22"/>
+          <w:i w:val="1"/>
+          <w:iCs w:val="1"/>
+        </w:rPr>
+        <w:t xml:space="preserve">Si al emitir queda un @clave@ sin resolver, el sistema rechaza la factura. Complete todos los tags pedibles o quite el tag de la plantilla.</w:t>
+      </w:r>
+    </w:p>
+    <w:p>
+      <w:pPr>
+        <w:numPr>
+          <w:ilvl w:val="0"/>
+          <w:numId w:val=""/>
+        </w:numPr>
+      </w:pPr>
+      <w:r>
+        <w:rPr/>
+        <w:t xml:space="preserve">Origen pedible: el operador completa el valor en el modal al facturar (o ya viene del abono).</w:t>
+      </w:r>
+    </w:p>
+    <w:p>
+      <w:pPr>
+        <w:numPr>
+          <w:ilvl w:val="0"/>
+          <w:numId w:val=""/>
+        </w:numPr>
+      </w:pPr>
+      <w:r>
+        <w:rPr/>
+        <w:t xml:space="preserve">Origen sistema: no se pide; se completa solo (cliente, CUIT, fecha de factura, empresa, código/nombre del concepto).</w:t>
+      </w:r>
+    </w:p>
+    <w:p>
+      <w:pPr>
+        <w:numPr>
+          <w:ilvl w:val="0"/>
+          <w:numId w:val=""/>
+        </w:numPr>
+      </w:pPr>
+      <w:r>
+        <w:rPr/>
+        <w:t xml:space="preserve">Detectar tags: si escribió @periodo@ en la plantilla, use la acción de detectar para generar filas de tags faltantes.</w:t>
+      </w:r>
+    </w:p>
+    <w:p>
+      <w:pPr>
+        <w:numPr>
+          <w:ilvl w:val="0"/>
+          <w:numId w:val=""/>
+        </w:numPr>
+      </w:pPr>
+      <w:r>
+        <w:rPr/>
+        <w:t xml:space="preserve">Condicionales: incluya texto solo si hay valor ({{#si dominio}}Dominio @dominio@{{/si}}) o si coincide ({{#si dominio=AB123CD}}…{{/si}}).</w:t>
+      </w:r>
+    </w:p>
+    <w:p>
+      <w:pPr>
+        <w:numPr>
+          <w:ilvl w:val="0"/>
+          <w:numId w:val=""/>
+        </w:numPr>
+      </w:pPr>
+      <w:r>
+        <w:rPr/>
+        <w:t xml:space="preserve">Tras guardar, pruebe el concepto en el facturador o desde un abono de prueba antes de usarlo en producción.</w:t>
+      </w:r>
+    </w:p>
+    <w:p/>
+    <w:p>
+      <w:pPr/>
+      <w:r>
+        <w:rPr>
+          <w:color w:val="2E75B6"/>
+          <w:sz w:val="22"/>
+          <w:szCs w:val="22"/>
+          <w:b w:val="1"/>
+          <w:bCs w:val="1"/>
+        </w:rPr>
+        <w:t xml:space="preserve">Herramientas de la pantalla</w:t>
+      </w:r>
+    </w:p>
+    <w:tbl>
+      <w:tblGrid>
+        <w:gridCol w:w="2800" w:type="dxa"/>
+        <w:gridCol w:w="2800" w:type="dxa"/>
+        <w:gridCol w:w="2800" w:type="dxa"/>
+        <w:gridCol w:w="2800" w:type="dxa"/>
+      </w:tblGrid>
+      <w:tblPr>
+        <w:tblW w:w="0" w:type="auto"/>
+        <w:tblLayout w:type="autofit"/>
+        <w:tblCellMar>
+          <w:top w:w="80" w:type="dxa"/>
+          <w:left w:w="80" w:type="dxa"/>
+          <w:right w:w="80" w:type="dxa"/>
+          <w:bottom w:w="80" w:type="dxa"/>
+        </w:tblCellMar>
+        <w:tblBorders>
+          <w:top w:val="single" w:sz="6" w:color="AAAAAA"/>
+          <w:left w:val="single" w:sz="6" w:color="AAAAAA"/>
+          <w:right w:val="single" w:sz="6" w:color="AAAAAA"/>
+          <w:bottom w:val="single" w:sz="6" w:color="AAAAAA"/>
+          <w:insideH w:val="single" w:sz="6" w:color="AAAAAA"/>
+          <w:insideV w:val="single" w:sz="6" w:color="AAAAAA"/>
+        </w:tblBorders>
+      </w:tblPr>
+      <w:tr>
+        <w:trPr/>
+        <w:tc>
+          <w:tcPr>
+            <w:tcW w:w="2800" w:type="dxa"/>
+            <w:shd w:val="clear" w:fill="2E75B6"/>
+            <w:noWrap/>
+          </w:tcPr>
+          <w:p>
+            <w:pPr/>
+            <w:r>
+              <w:rPr>
+                <w:color w:val="FFFFFF"/>
+                <w:sz w:val="20"/>
+                <w:szCs w:val="20"/>
+                <w:b w:val="1"/>
+                <w:bCs w:val="1"/>
+              </w:rPr>
+              <w:t xml:space="preserve">Herramienta</w:t>
+            </w:r>
+          </w:p>
+        </w:tc>
+        <w:tc>
+          <w:tcPr>
+            <w:tcW w:w="2800" w:type="dxa"/>
+            <w:shd w:val="clear" w:fill="2E75B6"/>
+            <w:noWrap/>
+          </w:tcPr>
+          <w:p>
+            <w:pPr/>
+            <w:r>
+              <w:rPr>
+                <w:color w:val="FFFFFF"/>
+                <w:sz w:val="20"/>
+                <w:szCs w:val="20"/>
+                <w:b w:val="1"/>
+                <w:bCs w:val="1"/>
+              </w:rPr>
+              <w:t xml:space="preserve">Ubicación</w:t>
+            </w:r>
+          </w:p>
+        </w:tc>
+        <w:tc>
+          <w:tcPr>
+            <w:tcW w:w="2800" w:type="dxa"/>
+            <w:shd w:val="clear" w:fill="2E75B6"/>
+            <w:noWrap/>
+          </w:tcPr>
+          <w:p>
+            <w:pPr/>
+            <w:r>
+              <w:rPr>
+                <w:color w:val="FFFFFF"/>
+                <w:sz w:val="20"/>
+                <w:szCs w:val="20"/>
+                <w:b w:val="1"/>
+                <w:bCs w:val="1"/>
+              </w:rPr>
+              <w:t xml:space="preserve">Qué hace</w:t>
+            </w:r>
+          </w:p>
+        </w:tc>
+        <w:tc>
+          <w:tcPr>
+            <w:tcW w:w="2800" w:type="dxa"/>
+            <w:shd w:val="clear" w:fill="2E75B6"/>
+            <w:noWrap/>
+          </w:tcPr>
+          <w:p>
+            <w:pPr/>
+            <w:r>
+              <w:rPr>
+                <w:color w:val="FFFFFF"/>
+                <w:sz w:val="20"/>
+                <w:szCs w:val="20"/>
+                <w:b w:val="1"/>
+                <w:bCs w:val="1"/>
+              </w:rPr>
+              <w:t xml:space="preserve">Permiso</w:t>
+            </w:r>
+          </w:p>
+        </w:tc>
+      </w:tr>
+      <w:tr>
+        <w:trPr/>
+        <w:tc>
+          <w:tcPr>
+            <w:tcW w:w="2800" w:type="dxa"/>
+            <w:noWrap/>
+          </w:tcPr>
+          <w:p>
+            <w:pPr/>
+            <w:r>
+              <w:rPr>
+                <w:sz w:val="20"/>
+                <w:szCs w:val="20"/>
+              </w:rPr>
+              <w:t xml:space="preserve">Nuevo concepto</w:t>
+            </w:r>
+          </w:p>
+        </w:tc>
+        <w:tc>
+          <w:tcPr>
+            <w:tcW w:w="2800" w:type="dxa"/>
+            <w:noWrap/>
+          </w:tcPr>
+          <w:p>
+            <w:pPr/>
+            <w:r>
+              <w:rPr>
+                <w:sz w:val="20"/>
+                <w:szCs w:val="20"/>
+              </w:rPr>
+              <w:t xml:space="preserve">Toolbar del listado</w:t>
+            </w:r>
+          </w:p>
+        </w:tc>
+        <w:tc>
+          <w:tcPr>
+            <w:tcW w:w="2800" w:type="dxa"/>
+            <w:noWrap/>
+          </w:tcPr>
+          <w:p>
+            <w:pPr/>
+            <w:r>
+              <w:rPr>
+                <w:sz w:val="20"/>
+                <w:szCs w:val="20"/>
+              </w:rPr>
+              <w:t xml:space="preserve">Alta de concepto con precio, IVA, cuenta y plantilla.</w:t>
+            </w:r>
+          </w:p>
+        </w:tc>
+        <w:tc>
+          <w:tcPr>
+            <w:tcW w:w="2800" w:type="dxa"/>
+            <w:noWrap/>
+          </w:tcPr>
+          <w:p>
+            <w:pPr/>
+            <w:r>
+              <w:rPr>
+                <w:sz w:val="20"/>
+                <w:szCs w:val="20"/>
+              </w:rPr>
+              <w:t xml:space="preserve">crear-conceptos-venta</w:t>
+            </w:r>
+          </w:p>
+        </w:tc>
+      </w:tr>
+      <w:tr>
+        <w:trPr/>
+        <w:tc>
+          <w:tcPr>
+            <w:tcW w:w="2800" w:type="dxa"/>
+            <w:noWrap/>
+          </w:tcPr>
+          <w:p>
+            <w:pPr/>
+            <w:r>
+              <w:rPr>
+                <w:sz w:val="20"/>
+                <w:szCs w:val="20"/>
+              </w:rPr>
+              <w:t xml:space="preserve">Solapa Tags</w:t>
+            </w:r>
+          </w:p>
+        </w:tc>
+        <w:tc>
+          <w:tcPr>
+            <w:tcW w:w="2800" w:type="dxa"/>
+            <w:noWrap/>
+          </w:tcPr>
+          <w:p>
+            <w:pPr/>
+            <w:r>
+              <w:rPr>
+                <w:sz w:val="20"/>
+                <w:szCs w:val="20"/>
+              </w:rPr>
+              <w:t xml:space="preserve">Formulario del concepto</w:t>
+            </w:r>
+          </w:p>
+        </w:tc>
+        <w:tc>
+          <w:tcPr>
+            <w:tcW w:w="2800" w:type="dxa"/>
+            <w:noWrap/>
+          </w:tcPr>
+          <w:p>
+            <w:pPr/>
+            <w:r>
+              <w:rPr>
+                <w:sz w:val="20"/>
+                <w:szCs w:val="20"/>
+              </w:rPr>
+              <w:t xml:space="preserve">Define claves @tag@, tipo, origen y opciones de lista.</w:t>
+            </w:r>
+          </w:p>
+        </w:tc>
+        <w:tc>
+          <w:tcPr>
+            <w:tcW w:w="2800" w:type="dxa"/>
+            <w:noWrap/>
+          </w:tcPr>
+          <w:p>
+            <w:pPr/>
+            <w:r>
+              <w:rPr>
+                <w:sz w:val="20"/>
+                <w:szCs w:val="20"/>
+              </w:rPr>
+              <w:t xml:space="preserve">editar-conceptos-venta</w:t>
+            </w:r>
+          </w:p>
+        </w:tc>
+      </w:tr>
+      <w:tr>
+        <w:trPr/>
+        <w:tc>
+          <w:tcPr>
+            <w:tcW w:w="2800" w:type="dxa"/>
+            <w:noWrap/>
+          </w:tcPr>
+          <w:p>
+            <w:pPr/>
+            <w:r>
+              <w:rPr>
+                <w:sz w:val="20"/>
+                <w:szCs w:val="20"/>
+              </w:rPr>
+              <w:t xml:space="preserve">Detectar tags</w:t>
+            </w:r>
+          </w:p>
+        </w:tc>
+        <w:tc>
+          <w:tcPr>
+            <w:tcW w:w="2800" w:type="dxa"/>
+            <w:noWrap/>
+          </w:tcPr>
+          <w:p>
+            <w:pPr/>
+            <w:r>
+              <w:rPr>
+                <w:sz w:val="20"/>
+                <w:szCs w:val="20"/>
+              </w:rPr>
+              <w:t xml:space="preserve">Solapa Tags</w:t>
+            </w:r>
+          </w:p>
+        </w:tc>
+        <w:tc>
+          <w:tcPr>
+            <w:tcW w:w="2800" w:type="dxa"/>
+            <w:noWrap/>
+          </w:tcPr>
+          <w:p>
+            <w:pPr/>
+            <w:r>
+              <w:rPr>
+                <w:sz w:val="20"/>
+                <w:szCs w:val="20"/>
+              </w:rPr>
+              <w:t xml:space="preserve">Genera filas a partir de @clave@ encontrados en la plantilla.</w:t>
+            </w:r>
+          </w:p>
+        </w:tc>
+        <w:tc>
+          <w:tcPr>
+            <w:tcW w:w="2800" w:type="dxa"/>
+            <w:noWrap/>
+          </w:tcPr>
+          <w:p>
+            <w:pPr/>
+            <w:r>
+              <w:rPr>
+                <w:sz w:val="20"/>
+                <w:szCs w:val="20"/>
+              </w:rPr>
+              <w:t xml:space="preserve">editar-conceptos-venta</w:t>
+            </w:r>
+          </w:p>
+        </w:tc>
+      </w:tr>
+      <w:tr>
+        <w:trPr/>
+        <w:tc>
+          <w:tcPr>
+            <w:tcW w:w="2800" w:type="dxa"/>
+            <w:noWrap/>
+          </w:tcPr>
+          <w:p>
+            <w:pPr/>
+            <w:r>
+              <w:rPr>
+                <w:sz w:val="20"/>
+                <w:szCs w:val="20"/>
+              </w:rPr>
+              <w:t xml:space="preserve">Exportar listado</w:t>
+            </w:r>
+          </w:p>
+        </w:tc>
+        <w:tc>
+          <w:tcPr>
+            <w:tcW w:w="2800" w:type="dxa"/>
+            <w:noWrap/>
+          </w:tcPr>
+          <w:p>
+            <w:pPr/>
+            <w:r>
+              <w:rPr>
+                <w:sz w:val="20"/>
+                <w:szCs w:val="20"/>
+              </w:rPr>
+              <w:t xml:space="preserve">Sobre la grilla</w:t>
+            </w:r>
+          </w:p>
+        </w:tc>
+        <w:tc>
+          <w:tcPr>
+            <w:tcW w:w="2800" w:type="dxa"/>
+            <w:noWrap/>
+          </w:tcPr>
+          <w:p>
+            <w:pPr/>
+            <w:r>
+              <w:rPr>
+                <w:sz w:val="20"/>
+                <w:szCs w:val="20"/>
+              </w:rPr>
+              <w:t xml:space="preserve">PDF / Excel / CSV de conceptos filtrados.</w:t>
+            </w:r>
+          </w:p>
+        </w:tc>
+        <w:tc>
+          <w:tcPr>
+            <w:tcW w:w="2800" w:type="dxa"/>
+            <w:noWrap/>
+          </w:tcPr>
+          <w:p>
+            <w:pPr/>
+            <w:r>
+              <w:rPr>
+                <w:sz w:val="20"/>
+                <w:szCs w:val="20"/>
+              </w:rPr>
+              <w:t xml:space="preserve">listar-conceptos-venta</w:t>
+            </w:r>
+          </w:p>
+        </w:tc>
+      </w:tr>
+    </w:tbl>
+    <w:p/>
+    <w:p>
+      <w:pPr/>
+      <w:r>
+        <w:rPr>
+          <w:color w:val="666666"/>
+          <w:sz w:val="18"/>
+          <w:szCs w:val="18"/>
+          <w:i w:val="1"/>
+          <w:iCs w:val="1"/>
+        </w:rPr>
+        <w:t xml:space="preserve">Tipos de tag</w:t>
+      </w:r>
+    </w:p>
+    <w:tbl>
+      <w:tblGrid>
+        <w:gridCol w:w="2800" w:type="dxa"/>
+        <w:gridCol w:w="2800" w:type="dxa"/>
+        <w:gridCol w:w="2800" w:type="dxa"/>
+      </w:tblGrid>
+      <w:tblPr>
+        <w:tblW w:w="0" w:type="auto"/>
+        <w:tblLayout w:type="autofit"/>
+        <w:tblCellMar>
+          <w:top w:w="80" w:type="dxa"/>
+          <w:left w:w="80" w:type="dxa"/>
+          <w:right w:w="80" w:type="dxa"/>
+          <w:bottom w:w="80" w:type="dxa"/>
+        </w:tblCellMar>
+        <w:tblBorders>
+          <w:top w:val="single" w:sz="6" w:color="AAAAAA"/>
+          <w:left w:val="single" w:sz="6" w:color="AAAAAA"/>
+          <w:right w:val="single" w:sz="6" w:color="AAAAAA"/>
+          <w:bottom w:val="single" w:sz="6" w:color="AAAAAA"/>
+          <w:insideH w:val="single" w:sz="6" w:color="AAAAAA"/>
+          <w:insideV w:val="single" w:sz="6" w:color="AAAAAA"/>
+        </w:tblBorders>
+      </w:tblPr>
+      <w:tr>
+        <w:trPr/>
+        <w:tc>
+          <w:tcPr>
+            <w:tcW w:w="2800" w:type="dxa"/>
+            <w:shd w:val="clear" w:fill="2E75B6"/>
+            <w:noWrap/>
+          </w:tcPr>
+          <w:p>
+            <w:pPr/>
+            <w:r>
+              <w:rPr>
+                <w:color w:val="FFFFFF"/>
+                <w:sz w:val="20"/>
+                <w:szCs w:val="20"/>
+                <w:b w:val="1"/>
+                <w:bCs w:val="1"/>
+              </w:rPr>
+              <w:t xml:space="preserve">Tipo</w:t>
+            </w:r>
+          </w:p>
+        </w:tc>
+        <w:tc>
+          <w:tcPr>
+            <w:tcW w:w="2800" w:type="dxa"/>
+            <w:shd w:val="clear" w:fill="2E75B6"/>
+            <w:noWrap/>
+          </w:tcPr>
+          <w:p>
+            <w:pPr/>
+            <w:r>
+              <w:rPr>
+                <w:color w:val="FFFFFF"/>
+                <w:sz w:val="20"/>
+                <w:szCs w:val="20"/>
+                <w:b w:val="1"/>
+                <w:bCs w:val="1"/>
+              </w:rPr>
+              <w:t xml:space="preserve">Ejemplo de uso</w:t>
+            </w:r>
+          </w:p>
+        </w:tc>
+        <w:tc>
+          <w:tcPr>
+            <w:tcW w:w="2800" w:type="dxa"/>
+            <w:shd w:val="clear" w:fill="2E75B6"/>
+            <w:noWrap/>
+          </w:tcPr>
+          <w:p>
+            <w:pPr/>
+            <w:r>
+              <w:rPr>
+                <w:color w:val="FFFFFF"/>
+                <w:sz w:val="20"/>
+                <w:szCs w:val="20"/>
+                <w:b w:val="1"/>
+                <w:bCs w:val="1"/>
+              </w:rPr>
+              <w:t xml:space="preserve">Cómo se completa</w:t>
+            </w:r>
+          </w:p>
+        </w:tc>
+      </w:tr>
+      <w:tr>
+        <w:trPr/>
+        <w:tc>
+          <w:tcPr>
+            <w:tcW w:w="2800" w:type="dxa"/>
+            <w:noWrap/>
+          </w:tcPr>
+          <w:p>
+            <w:pPr/>
+            <w:r>
+              <w:rPr>
+                <w:sz w:val="20"/>
+                <w:szCs w:val="20"/>
+              </w:rPr>
+              <w:t xml:space="preserve">texto</w:t>
+            </w:r>
+          </w:p>
+        </w:tc>
+        <w:tc>
+          <w:tcPr>
+            <w:tcW w:w="2800" w:type="dxa"/>
+            <w:noWrap/>
+          </w:tcPr>
+          <w:p>
+            <w:pPr/>
+            <w:r>
+              <w:rPr>
+                <w:sz w:val="20"/>
+                <w:szCs w:val="20"/>
+              </w:rPr>
+              <w:t xml:space="preserve">dominio, patente, referencia</w:t>
+            </w:r>
+          </w:p>
+        </w:tc>
+        <w:tc>
+          <w:tcPr>
+            <w:tcW w:w="2800" w:type="dxa"/>
+            <w:noWrap/>
+          </w:tcPr>
+          <w:p>
+            <w:pPr/>
+            <w:r>
+              <w:rPr>
+                <w:sz w:val="20"/>
+                <w:szCs w:val="20"/>
+              </w:rPr>
+              <w:t xml:space="preserve">Input libre (con largo máximo si se definió)</w:t>
+            </w:r>
+          </w:p>
+        </w:tc>
+      </w:tr>
+      <w:tr>
+        <w:trPr/>
+        <w:tc>
+          <w:tcPr>
+            <w:tcW w:w="2800" w:type="dxa"/>
+            <w:noWrap/>
+          </w:tcPr>
+          <w:p>
+            <w:pPr/>
+            <w:r>
+              <w:rPr>
+                <w:sz w:val="20"/>
+                <w:szCs w:val="20"/>
+              </w:rPr>
+              <w:t xml:space="preserve">fecha</w:t>
+            </w:r>
+          </w:p>
+        </w:tc>
+        <w:tc>
+          <w:tcPr>
+            <w:tcW w:w="2800" w:type="dxa"/>
+            <w:noWrap/>
+          </w:tcPr>
+          <w:p>
+            <w:pPr/>
+            <w:r>
+              <w:rPr>
+                <w:sz w:val="20"/>
+                <w:szCs w:val="20"/>
+              </w:rPr>
+              <w:t xml:space="preserve">vencimiento de servicio</w:t>
+            </w:r>
+          </w:p>
+        </w:tc>
+        <w:tc>
+          <w:tcPr>
+            <w:tcW w:w="2800" w:type="dxa"/>
+            <w:noWrap/>
+          </w:tcPr>
+          <w:p>
+            <w:pPr/>
+            <w:r>
+              <w:rPr>
+                <w:sz w:val="20"/>
+                <w:szCs w:val="20"/>
+              </w:rPr>
+              <w:t xml:space="preserve">Selector de fecha → se formatea dd/mm/aaaa</w:t>
+            </w:r>
+          </w:p>
+        </w:tc>
+      </w:tr>
+      <w:tr>
+        <w:trPr/>
+        <w:tc>
+          <w:tcPr>
+            <w:tcW w:w="2800" w:type="dxa"/>
+            <w:noWrap/>
+          </w:tcPr>
+          <w:p>
+            <w:pPr/>
+            <w:r>
+              <w:rPr>
+                <w:sz w:val="20"/>
+                <w:szCs w:val="20"/>
+              </w:rPr>
+              <w:t xml:space="preserve">periodo</w:t>
+            </w:r>
+          </w:p>
+        </w:tc>
+        <w:tc>
+          <w:tcPr>
+            <w:tcW w:w="2800" w:type="dxa"/>
+            <w:noWrap/>
+          </w:tcPr>
+          <w:p>
+            <w:pPr/>
+            <w:r>
+              <w:rPr>
+                <w:sz w:val="20"/>
+                <w:szCs w:val="20"/>
+              </w:rPr>
+              <w:t xml:space="preserve">mes a facturar</w:t>
+            </w:r>
+          </w:p>
+        </w:tc>
+        <w:tc>
+          <w:tcPr>
+            <w:tcW w:w="2800" w:type="dxa"/>
+            <w:noWrap/>
+          </w:tcPr>
+          <w:p>
+            <w:pPr/>
+            <w:r>
+              <w:rPr>
+                <w:sz w:val="20"/>
+                <w:szCs w:val="20"/>
+              </w:rPr>
+              <w:t xml:space="preserve">Desde–hasta o mes/año → texto «dd/mm/aaaa al dd/mm/aaaa»</w:t>
+            </w:r>
+          </w:p>
+        </w:tc>
+      </w:tr>
+      <w:tr>
+        <w:trPr/>
+        <w:tc>
+          <w:tcPr>
+            <w:tcW w:w="2800" w:type="dxa"/>
+            <w:noWrap/>
+          </w:tcPr>
+          <w:p>
+            <w:pPr/>
+            <w:r>
+              <w:rPr>
+                <w:sz w:val="20"/>
+                <w:szCs w:val="20"/>
+              </w:rPr>
+              <w:t xml:space="preserve">lista</w:t>
+            </w:r>
+          </w:p>
+        </w:tc>
+        <w:tc>
+          <w:tcPr>
+            <w:tcW w:w="2800" w:type="dxa"/>
+            <w:noWrap/>
+          </w:tcPr>
+          <w:p>
+            <w:pPr/>
+            <w:r>
+              <w:rPr>
+                <w:sz w:val="20"/>
+                <w:szCs w:val="20"/>
+              </w:rPr>
+              <w:t xml:space="preserve">tipo de abono</w:t>
+            </w:r>
+          </w:p>
+        </w:tc>
+        <w:tc>
+          <w:tcPr>
+            <w:tcW w:w="2800" w:type="dxa"/>
+            <w:noWrap/>
+          </w:tcPr>
+          <w:p>
+            <w:pPr/>
+            <w:r>
+              <w:rPr>
+                <w:sz w:val="20"/>
+                <w:szCs w:val="20"/>
+              </w:rPr>
+              <w:t xml:space="preserve">Select con opciones cargadas en el tag</w:t>
+            </w:r>
+          </w:p>
+        </w:tc>
+      </w:tr>
+    </w:tbl>
+    <w:p/>
+    <w:p>
+      <w:pPr>
+        <w:pStyle w:val="Heading2"/>
+      </w:pPr>
+      <w:bookmarkStart w:id="16" w:name="_Toc16"/>
+      <w:r>
+        <w:t>16. Tags de sistema y condicionales</w:t>
+      </w:r>
+      <w:bookmarkEnd w:id="16"/>
+    </w:p>
+    <w:p>
+      <w:pPr>
+        <w:jc w:val="both"/>
+        <w:spacing w:after="120"/>
+      </w:pPr>
+      <w:r>
+        <w:rPr>
+          <w:sz w:val="22"/>
+          <w:szCs w:val="22"/>
+        </w:rPr>
+        <w:t xml:space="preserve">Los tags de sistema se rellenan automáticamente al emitir. No hace falta cargarlos en el abono ni en el modal.</w:t>
+      </w:r>
+    </w:p>
+    <w:p>
+      <w:pPr>
+        <w:numPr>
+          <w:ilvl w:val="0"/>
+          <w:numId w:val=""/>
+        </w:numPr>
+      </w:pPr>
+      <w:r>
+        <w:rPr/>
+        <w:t xml:space="preserve">{{#si clave}}texto si la clave tiene valor{{/si}} — muestra el bloque solo si el tag tiene contenido.</w:t>
+      </w:r>
+    </w:p>
+    <w:p>
+      <w:pPr>
+        <w:numPr>
+          <w:ilvl w:val="0"/>
+          <w:numId w:val=""/>
+        </w:numPr>
+      </w:pPr>
+      <w:r>
+        <w:rPr/>
+        <w:t xml:space="preserve">{{#si clave=valor}}texto si coincide{{/si}} — muestra el bloque solo si el valor del tag es exactamente «valor».</w:t>
+      </w:r>
+    </w:p>
+    <w:p>
+      <w:pPr>
+        <w:numPr>
+          <w:ilvl w:val="0"/>
+          <w:numId w:val=""/>
+        </w:numPr>
+      </w:pPr>
+      <w:r>
+        <w:rPr/>
+        <w:t xml:space="preserve">Dentro del bloque puede usar otros tags (@clave@). Tras resolver condicionales y tags, el texto final no debe contener @…@ ni {{#si…}}.</w:t>
+      </w:r>
+    </w:p>
+    <w:p/>
+    <w:p>
+      <w:pPr>
+        <w:jc w:val="both"/>
+        <w:spacing w:after="120"/>
+      </w:pPr>
+      <w:r>
+        <w:rPr>
+          <w:sz w:val="22"/>
+          <w:szCs w:val="22"/>
+        </w:rPr>
+        <w:t xml:space="preserve">Condicionales (sintaxis literal en la plantilla del concepto):</w:t>
+      </w:r>
+    </w:p>
+    <w:p>
+      <w:pPr/>
+      <w:r>
+        <w:rPr>
+          <w:color w:val="666666"/>
+          <w:sz w:val="18"/>
+          <w:szCs w:val="18"/>
+          <w:i w:val="1"/>
+          <w:iCs w:val="1"/>
+        </w:rPr>
+        <w:t xml:space="preserve">Tags de sistema</w:t>
+      </w:r>
+    </w:p>
+    <w:tbl>
+      <w:tblGrid>
+        <w:gridCol w:w="2800" w:type="dxa"/>
+        <w:gridCol w:w="2800" w:type="dxa"/>
+      </w:tblGrid>
+      <w:tblPr>
+        <w:tblW w:w="0" w:type="auto"/>
+        <w:tblLayout w:type="autofit"/>
+        <w:tblCellMar>
+          <w:top w:w="80" w:type="dxa"/>
+          <w:left w:w="80" w:type="dxa"/>
+          <w:right w:w="80" w:type="dxa"/>
+          <w:bottom w:w="80" w:type="dxa"/>
+        </w:tblCellMar>
+        <w:tblBorders>
+          <w:top w:val="single" w:sz="6" w:color="AAAAAA"/>
+          <w:left w:val="single" w:sz="6" w:color="AAAAAA"/>
+          <w:right w:val="single" w:sz="6" w:color="AAAAAA"/>
+          <w:bottom w:val="single" w:sz="6" w:color="AAAAAA"/>
+          <w:insideH w:val="single" w:sz="6" w:color="AAAAAA"/>
+          <w:insideV w:val="single" w:sz="6" w:color="AAAAAA"/>
+        </w:tblBorders>
+      </w:tblPr>
+      <w:tr>
+        <w:trPr/>
+        <w:tc>
+          <w:tcPr>
+            <w:tcW w:w="2800" w:type="dxa"/>
+            <w:shd w:val="clear" w:fill="2E75B6"/>
+            <w:noWrap/>
+          </w:tcPr>
+          <w:p>
+            <w:pPr/>
+            <w:r>
+              <w:rPr>
+                <w:color w:val="FFFFFF"/>
+                <w:sz w:val="20"/>
+                <w:szCs w:val="20"/>
+                <w:b w:val="1"/>
+                <w:bCs w:val="1"/>
+              </w:rPr>
+              <w:t xml:space="preserve">Tag en plantilla</w:t>
+            </w:r>
+          </w:p>
+        </w:tc>
+        <w:tc>
+          <w:tcPr>
+            <w:tcW w:w="2800" w:type="dxa"/>
+            <w:shd w:val="clear" w:fill="2E75B6"/>
+            <w:noWrap/>
+          </w:tcPr>
+          <w:p>
+            <w:pPr/>
+            <w:r>
+              <w:rPr>
+                <w:color w:val="FFFFFF"/>
+                <w:sz w:val="20"/>
+                <w:szCs w:val="20"/>
+                <w:b w:val="1"/>
+                <w:bCs w:val="1"/>
+              </w:rPr>
+              <w:t xml:space="preserve">Valor</w:t>
+            </w:r>
+          </w:p>
+        </w:tc>
+      </w:tr>
+      <w:tr>
+        <w:trPr/>
+        <w:tc>
+          <w:tcPr>
+            <w:tcW w:w="2800" w:type="dxa"/>
+            <w:noWrap/>
+          </w:tcPr>
+          <w:p>
+            <w:pPr/>
+            <w:r>
+              <w:rPr>
+                <w:sz w:val="20"/>
+                <w:szCs w:val="20"/>
+              </w:rPr>
+              <w:t xml:space="preserve">@cliente@</w:t>
+            </w:r>
+          </w:p>
+        </w:tc>
+        <w:tc>
+          <w:tcPr>
+            <w:tcW w:w="2800" w:type="dxa"/>
+            <w:noWrap/>
+          </w:tcPr>
+          <w:p>
+            <w:pPr/>
+            <w:r>
+              <w:rPr>
+                <w:sz w:val="20"/>
+                <w:szCs w:val="20"/>
+              </w:rPr>
+              <w:t xml:space="preserve">Nombre del cliente de la factura</w:t>
+            </w:r>
+          </w:p>
+        </w:tc>
+      </w:tr>
+      <w:tr>
+        <w:trPr/>
+        <w:tc>
+          <w:tcPr>
+            <w:tcW w:w="2800" w:type="dxa"/>
+            <w:noWrap/>
+          </w:tcPr>
+          <w:p>
+            <w:pPr/>
+            <w:r>
+              <w:rPr>
+                <w:sz w:val="20"/>
+                <w:szCs w:val="20"/>
+              </w:rPr>
+              <w:t xml:space="preserve">@cuit@</w:t>
+            </w:r>
+          </w:p>
+        </w:tc>
+        <w:tc>
+          <w:tcPr>
+            <w:tcW w:w="2800" w:type="dxa"/>
+            <w:noWrap/>
+          </w:tcPr>
+          <w:p>
+            <w:pPr/>
+            <w:r>
+              <w:rPr>
+                <w:sz w:val="20"/>
+                <w:szCs w:val="20"/>
+              </w:rPr>
+              <w:t xml:space="preserve">CUIT/CUIL/DNI del cliente</w:t>
+            </w:r>
+          </w:p>
+        </w:tc>
+      </w:tr>
+      <w:tr>
+        <w:trPr/>
+        <w:tc>
+          <w:tcPr>
+            <w:tcW w:w="2800" w:type="dxa"/>
+            <w:noWrap/>
+          </w:tcPr>
+          <w:p>
+            <w:pPr/>
+            <w:r>
+              <w:rPr>
+                <w:sz w:val="20"/>
+                <w:szCs w:val="20"/>
+              </w:rPr>
+              <w:t xml:space="preserve">@fecha_factura@</w:t>
+            </w:r>
+          </w:p>
+        </w:tc>
+        <w:tc>
+          <w:tcPr>
+            <w:tcW w:w="2800" w:type="dxa"/>
+            <w:noWrap/>
+          </w:tcPr>
+          <w:p>
+            <w:pPr/>
+            <w:r>
+              <w:rPr>
+                <w:sz w:val="20"/>
+                <w:szCs w:val="20"/>
+              </w:rPr>
+              <w:t xml:space="preserve">Fecha del comprobante</w:t>
+            </w:r>
+          </w:p>
+        </w:tc>
+      </w:tr>
+      <w:tr>
+        <w:trPr/>
+        <w:tc>
+          <w:tcPr>
+            <w:tcW w:w="2800" w:type="dxa"/>
+            <w:noWrap/>
+          </w:tcPr>
+          <w:p>
+            <w:pPr/>
+            <w:r>
+              <w:rPr>
+                <w:sz w:val="20"/>
+                <w:szCs w:val="20"/>
+              </w:rPr>
+              <w:t xml:space="preserve">@empresa@</w:t>
+            </w:r>
+          </w:p>
+        </w:tc>
+        <w:tc>
+          <w:tcPr>
+            <w:tcW w:w="2800" w:type="dxa"/>
+            <w:noWrap/>
+          </w:tcPr>
+          <w:p>
+            <w:pPr/>
+            <w:r>
+              <w:rPr>
+                <w:sz w:val="20"/>
+                <w:szCs w:val="20"/>
+              </w:rPr>
+              <w:t xml:space="preserve">Empresa del comprobante</w:t>
+            </w:r>
+          </w:p>
+        </w:tc>
+      </w:tr>
+      <w:tr>
+        <w:trPr/>
+        <w:tc>
+          <w:tcPr>
+            <w:tcW w:w="2800" w:type="dxa"/>
+            <w:noWrap/>
+          </w:tcPr>
+          <w:p>
+            <w:pPr/>
+            <w:r>
+              <w:rPr>
+                <w:sz w:val="20"/>
+                <w:szCs w:val="20"/>
+              </w:rPr>
+              <w:t xml:space="preserve">@codigo_concepto@</w:t>
+            </w:r>
+          </w:p>
+        </w:tc>
+        <w:tc>
+          <w:tcPr>
+            <w:tcW w:w="2800" w:type="dxa"/>
+            <w:noWrap/>
+          </w:tcPr>
+          <w:p>
+            <w:pPr/>
+            <w:r>
+              <w:rPr>
+                <w:sz w:val="20"/>
+                <w:szCs w:val="20"/>
+              </w:rPr>
+              <w:t xml:space="preserve">Código del concepto elegido</w:t>
+            </w:r>
+          </w:p>
+        </w:tc>
+      </w:tr>
+      <w:tr>
+        <w:trPr/>
+        <w:tc>
+          <w:tcPr>
+            <w:tcW w:w="2800" w:type="dxa"/>
+            <w:noWrap/>
+          </w:tcPr>
+          <w:p>
+            <w:pPr/>
+            <w:r>
+              <w:rPr>
+                <w:sz w:val="20"/>
+                <w:szCs w:val="20"/>
+              </w:rPr>
+              <w:t xml:space="preserve">@nombre_concepto@</w:t>
+            </w:r>
+          </w:p>
+        </w:tc>
+        <w:tc>
+          <w:tcPr>
+            <w:tcW w:w="2800" w:type="dxa"/>
+            <w:noWrap/>
+          </w:tcPr>
+          <w:p>
+            <w:pPr/>
+            <w:r>
+              <w:rPr>
+                <w:sz w:val="20"/>
+                <w:szCs w:val="20"/>
+              </w:rPr>
+              <w:t xml:space="preserve">Nombre del concepto</w:t>
+            </w:r>
+          </w:p>
+        </w:tc>
+      </w:tr>
+    </w:tbl>
+    <w:p/>
+    <w:p>
+      <w:pPr>
+        <w:pStyle w:val="Heading2"/>
+      </w:pPr>
+      <w:bookmarkStart w:id="17" w:name="_Toc17"/>
+      <w:r>
+        <w:t>17. Abonos / contratos de cliente</w:t>
+      </w:r>
+      <w:bookmarkEnd w:id="17"/>
+    </w:p>
+    <w:p>
+      <w:pPr>
+        <w:jc w:val="both"/>
+        <w:spacing w:after="120"/>
+      </w:pPr>
+      <w:r>
+        <w:rPr>
+          <w:sz w:val="22"/>
+          <w:szCs w:val="22"/>
+        </w:rPr>
+        <w:t xml:space="preserve">El abono (contrato de venta) vincula un cliente con un concepto, con vigencia, periodicidad, precio opcional y datos fijos (los mismos tags del concepto).</w:t>
+      </w:r>
+    </w:p>
+    <w:p>
+      <w:pPr>
+        <w:jc w:val="both"/>
+        <w:spacing w:after="120"/>
+      </w:pPr>
+      <w:r>
+        <w:rPr>
+          <w:sz w:val="22"/>
+          <w:szCs w:val="22"/>
+        </w:rPr>
+        <w:t xml:space="preserve">Acceso: Ventas → Abonos → Abonos / contratos (ventas/contrato-venta). Alta con Nuevo registro; edición desde el listado.</w:t>
+      </w:r>
+    </w:p>
+    <w:p>
+      <w:pPr>
+        <w:jc w:val="both"/>
+        <w:spacing w:after="120"/>
+      </w:pPr>
+      <w:r>
+        <w:rPr>
+          <w:sz w:val="22"/>
+          <w:szCs w:val="22"/>
+          <w:i w:val="1"/>
+          <w:iCs w:val="1"/>
+        </w:rPr>
+        <w:t xml:space="preserve">Suspenda el abono si el cliente deja de usar el servicio; así deja de aparecer en la cola sin borrar el histórico.</w:t>
+      </w:r>
+    </w:p>
+    <w:p>
+      <w:pPr>
+        <w:numPr>
+          <w:ilvl w:val="0"/>
+          <w:numId w:val=""/>
+        </w:numPr>
+      </w:pPr>
+      <w:r>
+        <w:rPr/>
+        <w:t xml:space="preserve">Al elegir el concepto, la grilla de datos muestra los tags pedibles de esa plantilla.</w:t>
+      </w:r>
+    </w:p>
+    <w:p>
+      <w:pPr>
+        <w:numPr>
+          <w:ilvl w:val="0"/>
+          <w:numId w:val=""/>
+        </w:numPr>
+      </w:pPr>
+      <w:r>
+        <w:rPr/>
+        <w:t xml:space="preserve">Complete los datos fijos una sola vez; al facturar solo pedirá lo que falte (típicamente el período).</w:t>
+      </w:r>
+    </w:p>
+    <w:p>
+      <w:pPr>
+        <w:numPr>
+          <w:ilvl w:val="0"/>
+          <w:numId w:val=""/>
+        </w:numPr>
+      </w:pPr>
+      <w:r>
+        <w:rPr/>
+        <w:t xml:space="preserve">Use el prefill / facturar desde el abono o desde la cola para no rearmar el renglón a mano.</w:t>
+      </w:r>
+    </w:p>
+    <w:p>
+      <w:pPr>
+        <w:numPr>
+          <w:ilvl w:val="0"/>
+          <w:numId w:val=""/>
+        </w:numPr>
+      </w:pPr>
+      <w:r>
+        <w:rPr/>
+        <w:t xml:space="preserve">El historial de períodos facturados queda asociado al abono (auditoría de qué mes se emitió).</w:t>
+      </w:r>
+    </w:p>
+    <w:p/>
+    <w:p>
+      <w:pPr/>
+      <w:r>
+        <w:rPr>
+          <w:color w:val="2E75B6"/>
+          <w:sz w:val="22"/>
+          <w:szCs w:val="22"/>
+          <w:b w:val="1"/>
+          <w:bCs w:val="1"/>
+        </w:rPr>
+        <w:t xml:space="preserve">Herramientas de la pantalla</w:t>
+      </w:r>
+    </w:p>
+    <w:tbl>
+      <w:tblGrid>
+        <w:gridCol w:w="2800" w:type="dxa"/>
+        <w:gridCol w:w="2800" w:type="dxa"/>
+        <w:gridCol w:w="2800" w:type="dxa"/>
+        <w:gridCol w:w="2800" w:type="dxa"/>
+      </w:tblGrid>
+      <w:tblPr>
+        <w:tblW w:w="0" w:type="auto"/>
+        <w:tblLayout w:type="autofit"/>
+        <w:tblCellMar>
+          <w:top w:w="80" w:type="dxa"/>
+          <w:left w:w="80" w:type="dxa"/>
+          <w:right w:w="80" w:type="dxa"/>
+          <w:bottom w:w="80" w:type="dxa"/>
+        </w:tblCellMar>
+        <w:tblBorders>
+          <w:top w:val="single" w:sz="6" w:color="AAAAAA"/>
+          <w:left w:val="single" w:sz="6" w:color="AAAAAA"/>
+          <w:right w:val="single" w:sz="6" w:color="AAAAAA"/>
+          <w:bottom w:val="single" w:sz="6" w:color="AAAAAA"/>
+          <w:insideH w:val="single" w:sz="6" w:color="AAAAAA"/>
+          <w:insideV w:val="single" w:sz="6" w:color="AAAAAA"/>
+        </w:tblBorders>
+      </w:tblPr>
+      <w:tr>
+        <w:trPr/>
+        <w:tc>
+          <w:tcPr>
+            <w:tcW w:w="2800" w:type="dxa"/>
+            <w:shd w:val="clear" w:fill="2E75B6"/>
+            <w:noWrap/>
+          </w:tcPr>
+          <w:p>
+            <w:pPr/>
+            <w:r>
+              <w:rPr>
+                <w:color w:val="FFFFFF"/>
+                <w:sz w:val="20"/>
+                <w:szCs w:val="20"/>
+                <w:b w:val="1"/>
+                <w:bCs w:val="1"/>
+              </w:rPr>
+              <w:t xml:space="preserve">Herramienta</w:t>
+            </w:r>
+          </w:p>
+        </w:tc>
+        <w:tc>
+          <w:tcPr>
+            <w:tcW w:w="2800" w:type="dxa"/>
+            <w:shd w:val="clear" w:fill="2E75B6"/>
+            <w:noWrap/>
+          </w:tcPr>
+          <w:p>
+            <w:pPr/>
+            <w:r>
+              <w:rPr>
+                <w:color w:val="FFFFFF"/>
+                <w:sz w:val="20"/>
+                <w:szCs w:val="20"/>
+                <w:b w:val="1"/>
+                <w:bCs w:val="1"/>
+              </w:rPr>
+              <w:t xml:space="preserve">Ubicación</w:t>
+            </w:r>
+          </w:p>
+        </w:tc>
+        <w:tc>
+          <w:tcPr>
+            <w:tcW w:w="2800" w:type="dxa"/>
+            <w:shd w:val="clear" w:fill="2E75B6"/>
+            <w:noWrap/>
+          </w:tcPr>
+          <w:p>
+            <w:pPr/>
+            <w:r>
+              <w:rPr>
+                <w:color w:val="FFFFFF"/>
+                <w:sz w:val="20"/>
+                <w:szCs w:val="20"/>
+                <w:b w:val="1"/>
+                <w:bCs w:val="1"/>
+              </w:rPr>
+              <w:t xml:space="preserve">Qué hace</w:t>
+            </w:r>
+          </w:p>
+        </w:tc>
+        <w:tc>
+          <w:tcPr>
+            <w:tcW w:w="2800" w:type="dxa"/>
+            <w:shd w:val="clear" w:fill="2E75B6"/>
+            <w:noWrap/>
+          </w:tcPr>
+          <w:p>
+            <w:pPr/>
+            <w:r>
+              <w:rPr>
+                <w:color w:val="FFFFFF"/>
+                <w:sz w:val="20"/>
+                <w:szCs w:val="20"/>
+                <w:b w:val="1"/>
+                <w:bCs w:val="1"/>
+              </w:rPr>
+              <w:t xml:space="preserve">Permiso</w:t>
+            </w:r>
+          </w:p>
+        </w:tc>
+      </w:tr>
+      <w:tr>
+        <w:trPr/>
+        <w:tc>
+          <w:tcPr>
+            <w:tcW w:w="2800" w:type="dxa"/>
+            <w:noWrap/>
+          </w:tcPr>
+          <w:p>
+            <w:pPr/>
+            <w:r>
+              <w:rPr>
+                <w:sz w:val="20"/>
+                <w:szCs w:val="20"/>
+              </w:rPr>
+              <w:t xml:space="preserve">Nuevo abono</w:t>
+            </w:r>
+          </w:p>
+        </w:tc>
+        <w:tc>
+          <w:tcPr>
+            <w:tcW w:w="2800" w:type="dxa"/>
+            <w:noWrap/>
+          </w:tcPr>
+          <w:p>
+            <w:pPr/>
+            <w:r>
+              <w:rPr>
+                <w:sz w:val="20"/>
+                <w:szCs w:val="20"/>
+              </w:rPr>
+              <w:t xml:space="preserve">Toolbar del listado</w:t>
+            </w:r>
+          </w:p>
+        </w:tc>
+        <w:tc>
+          <w:tcPr>
+            <w:tcW w:w="2800" w:type="dxa"/>
+            <w:noWrap/>
+          </w:tcPr>
+          <w:p>
+            <w:pPr/>
+            <w:r>
+              <w:rPr>
+                <w:sz w:val="20"/>
+                <w:szCs w:val="20"/>
+              </w:rPr>
+              <w:t xml:space="preserve">Alta de contrato cliente + concepto + vigencia.</w:t>
+            </w:r>
+          </w:p>
+        </w:tc>
+        <w:tc>
+          <w:tcPr>
+            <w:tcW w:w="2800" w:type="dxa"/>
+            <w:noWrap/>
+          </w:tcPr>
+          <w:p>
+            <w:pPr/>
+            <w:r>
+              <w:rPr>
+                <w:sz w:val="20"/>
+                <w:szCs w:val="20"/>
+              </w:rPr>
+              <w:t xml:space="preserve">crear-contratos-venta</w:t>
+            </w:r>
+          </w:p>
+        </w:tc>
+      </w:tr>
+      <w:tr>
+        <w:trPr/>
+        <w:tc>
+          <w:tcPr>
+            <w:tcW w:w="2800" w:type="dxa"/>
+            <w:noWrap/>
+          </w:tcPr>
+          <w:p>
+            <w:pPr/>
+            <w:r>
+              <w:rPr>
+                <w:sz w:val="20"/>
+                <w:szCs w:val="20"/>
+              </w:rPr>
+              <w:t xml:space="preserve">Datos fijos (tags)</w:t>
+            </w:r>
+          </w:p>
+        </w:tc>
+        <w:tc>
+          <w:tcPr>
+            <w:tcW w:w="2800" w:type="dxa"/>
+            <w:noWrap/>
+          </w:tcPr>
+          <w:p>
+            <w:pPr/>
+            <w:r>
+              <w:rPr>
+                <w:sz w:val="20"/>
+                <w:szCs w:val="20"/>
+              </w:rPr>
+              <w:t xml:space="preserve">Formulario del abono</w:t>
+            </w:r>
+          </w:p>
+        </w:tc>
+        <w:tc>
+          <w:tcPr>
+            <w:tcW w:w="2800" w:type="dxa"/>
+            <w:noWrap/>
+          </w:tcPr>
+          <w:p>
+            <w:pPr/>
+            <w:r>
+              <w:rPr>
+                <w:sz w:val="20"/>
+                <w:szCs w:val="20"/>
+              </w:rPr>
+              <w:t xml:space="preserve">Completa valores que no cambian cada período (dominio, patente…).</w:t>
+            </w:r>
+          </w:p>
+        </w:tc>
+        <w:tc>
+          <w:tcPr>
+            <w:tcW w:w="2800" w:type="dxa"/>
+            <w:noWrap/>
+          </w:tcPr>
+          <w:p>
+            <w:pPr/>
+            <w:r>
+              <w:rPr>
+                <w:sz w:val="20"/>
+                <w:szCs w:val="20"/>
+              </w:rPr>
+              <w:t xml:space="preserve">editar-contratos-venta</w:t>
+            </w:r>
+          </w:p>
+        </w:tc>
+      </w:tr>
+      <w:tr>
+        <w:trPr/>
+        <w:tc>
+          <w:tcPr>
+            <w:tcW w:w="2800" w:type="dxa"/>
+            <w:noWrap/>
+          </w:tcPr>
+          <w:p>
+            <w:pPr/>
+            <w:r>
+              <w:rPr>
+                <w:sz w:val="20"/>
+                <w:szCs w:val="20"/>
+              </w:rPr>
+              <w:t xml:space="preserve">Prefill / Facturar</w:t>
+            </w:r>
+          </w:p>
+        </w:tc>
+        <w:tc>
+          <w:tcPr>
+            <w:tcW w:w="2800" w:type="dxa"/>
+            <w:noWrap/>
+          </w:tcPr>
+          <w:p>
+            <w:pPr/>
+            <w:r>
+              <w:rPr>
+                <w:sz w:val="20"/>
+                <w:szCs w:val="20"/>
+              </w:rPr>
+              <w:t xml:space="preserve">Acciones del abono</w:t>
+            </w:r>
+          </w:p>
+        </w:tc>
+        <w:tc>
+          <w:tcPr>
+            <w:tcW w:w="2800" w:type="dxa"/>
+            <w:noWrap/>
+          </w:tcPr>
+          <w:p>
+            <w:pPr/>
+            <w:r>
+              <w:rPr>
+                <w:sz w:val="20"/>
+                <w:szCs w:val="20"/>
+              </w:rPr>
+              <w:t xml:space="preserve">Prepara el facturador con cliente, concepto y tags.</w:t>
+            </w:r>
+          </w:p>
+        </w:tc>
+        <w:tc>
+          <w:tcPr>
+            <w:tcW w:w="2800" w:type="dxa"/>
+            <w:noWrap/>
+          </w:tcPr>
+          <w:p>
+            <w:pPr/>
+            <w:r>
+              <w:rPr>
+                <w:sz w:val="20"/>
+                <w:szCs w:val="20"/>
+              </w:rPr>
+              <w:t xml:space="preserve">editar-contratos-venta</w:t>
+            </w:r>
+          </w:p>
+        </w:tc>
+      </w:tr>
+      <w:tr>
+        <w:trPr/>
+        <w:tc>
+          <w:tcPr>
+            <w:tcW w:w="2800" w:type="dxa"/>
+            <w:noWrap/>
+          </w:tcPr>
+          <w:p>
+            <w:pPr/>
+            <w:r>
+              <w:rPr>
+                <w:sz w:val="20"/>
+                <w:szCs w:val="20"/>
+              </w:rPr>
+              <w:t xml:space="preserve">Histórico de períodos</w:t>
+            </w:r>
+          </w:p>
+        </w:tc>
+        <w:tc>
+          <w:tcPr>
+            <w:tcW w:w="2800" w:type="dxa"/>
+            <w:noWrap/>
+          </w:tcPr>
+          <w:p>
+            <w:pPr/>
+            <w:r>
+              <w:rPr>
+                <w:sz w:val="20"/>
+                <w:szCs w:val="20"/>
+              </w:rPr>
+              <w:t xml:space="preserve">Detalle del abono</w:t>
+            </w:r>
+          </w:p>
+        </w:tc>
+        <w:tc>
+          <w:tcPr>
+            <w:tcW w:w="2800" w:type="dxa"/>
+            <w:noWrap/>
+          </w:tcPr>
+          <w:p>
+            <w:pPr/>
+            <w:r>
+              <w:rPr>
+                <w:sz w:val="20"/>
+                <w:szCs w:val="20"/>
+              </w:rPr>
+              <w:t xml:space="preserve">Consulta qué períodos ya fueron facturados.</w:t>
+            </w:r>
+          </w:p>
+        </w:tc>
+        <w:tc>
+          <w:tcPr>
+            <w:tcW w:w="2800" w:type="dxa"/>
+            <w:noWrap/>
+          </w:tcPr>
+          <w:p>
+            <w:pPr/>
+            <w:r>
+              <w:rPr>
+                <w:sz w:val="20"/>
+                <w:szCs w:val="20"/>
+              </w:rPr>
+              <w:t xml:space="preserve">listar-contratos-venta</w:t>
+            </w:r>
+          </w:p>
+        </w:tc>
+      </w:tr>
+    </w:tbl>
+    <w:p/>
+    <w:p>
+      <w:pPr/>
+      <w:r>
+        <w:rPr>
+          <w:color w:val="666666"/>
+          <w:sz w:val="18"/>
+          <w:szCs w:val="18"/>
+          <w:i w:val="1"/>
+          <w:iCs w:val="1"/>
+        </w:rPr>
+        <w:t xml:space="preserve">Campos principales del abono</w:t>
+      </w:r>
+    </w:p>
+    <w:tbl>
+      <w:tblGrid>
+        <w:gridCol w:w="2800" w:type="dxa"/>
+        <w:gridCol w:w="2800" w:type="dxa"/>
+      </w:tblGrid>
+      <w:tblPr>
+        <w:tblW w:w="0" w:type="auto"/>
+        <w:tblLayout w:type="autofit"/>
+        <w:tblCellMar>
+          <w:top w:w="80" w:type="dxa"/>
+          <w:left w:w="80" w:type="dxa"/>
+          <w:right w:w="80" w:type="dxa"/>
+          <w:bottom w:w="80" w:type="dxa"/>
+        </w:tblCellMar>
+        <w:tblBorders>
+          <w:top w:val="single" w:sz="6" w:color="AAAAAA"/>
+          <w:left w:val="single" w:sz="6" w:color="AAAAAA"/>
+          <w:right w:val="single" w:sz="6" w:color="AAAAAA"/>
+          <w:bottom w:val="single" w:sz="6" w:color="AAAAAA"/>
+          <w:insideH w:val="single" w:sz="6" w:color="AAAAAA"/>
+          <w:insideV w:val="single" w:sz="6" w:color="AAAAAA"/>
+        </w:tblBorders>
+      </w:tblPr>
+      <w:tr>
+        <w:trPr/>
+        <w:tc>
+          <w:tcPr>
+            <w:tcW w:w="2800" w:type="dxa"/>
+            <w:shd w:val="clear" w:fill="2E75B6"/>
+            <w:noWrap/>
+          </w:tcPr>
+          <w:p>
+            <w:pPr/>
+            <w:r>
+              <w:rPr>
+                <w:color w:val="FFFFFF"/>
+                <w:sz w:val="20"/>
+                <w:szCs w:val="20"/>
+                <w:b w:val="1"/>
+                <w:bCs w:val="1"/>
+              </w:rPr>
+              <w:t xml:space="preserve">Campo</w:t>
+            </w:r>
+          </w:p>
+        </w:tc>
+        <w:tc>
+          <w:tcPr>
+            <w:tcW w:w="2800" w:type="dxa"/>
+            <w:shd w:val="clear" w:fill="2E75B6"/>
+            <w:noWrap/>
+          </w:tcPr>
+          <w:p>
+            <w:pPr/>
+            <w:r>
+              <w:rPr>
+                <w:color w:val="FFFFFF"/>
+                <w:sz w:val="20"/>
+                <w:szCs w:val="20"/>
+                <w:b w:val="1"/>
+                <w:bCs w:val="1"/>
+              </w:rPr>
+              <w:t xml:space="preserve">Descripción</w:t>
+            </w:r>
+          </w:p>
+        </w:tc>
+      </w:tr>
+      <w:tr>
+        <w:trPr/>
+        <w:tc>
+          <w:tcPr>
+            <w:tcW w:w="2800" w:type="dxa"/>
+            <w:noWrap/>
+          </w:tcPr>
+          <w:p>
+            <w:pPr/>
+            <w:r>
+              <w:rPr>
+                <w:sz w:val="20"/>
+                <w:szCs w:val="20"/>
+              </w:rPr>
+              <w:t xml:space="preserve">Cliente</w:t>
+            </w:r>
+          </w:p>
+        </w:tc>
+        <w:tc>
+          <w:tcPr>
+            <w:tcW w:w="2800" w:type="dxa"/>
+            <w:noWrap/>
+          </w:tcPr>
+          <w:p>
+            <w:pPr/>
+            <w:r>
+              <w:rPr>
+                <w:sz w:val="20"/>
+                <w:szCs w:val="20"/>
+              </w:rPr>
+              <w:t xml:space="preserve">Cliente al que se factura el servicio (consulta por código / lupa).</w:t>
+            </w:r>
+          </w:p>
+        </w:tc>
+      </w:tr>
+      <w:tr>
+        <w:trPr/>
+        <w:tc>
+          <w:tcPr>
+            <w:tcW w:w="2800" w:type="dxa"/>
+            <w:noWrap/>
+          </w:tcPr>
+          <w:p>
+            <w:pPr/>
+            <w:r>
+              <w:rPr>
+                <w:sz w:val="20"/>
+                <w:szCs w:val="20"/>
+              </w:rPr>
+              <w:t xml:space="preserve">Concepto de venta</w:t>
+            </w:r>
+          </w:p>
+        </w:tc>
+        <w:tc>
+          <w:tcPr>
+            <w:tcW w:w="2800" w:type="dxa"/>
+            <w:noWrap/>
+          </w:tcPr>
+          <w:p>
+            <w:pPr/>
+            <w:r>
+              <w:rPr>
+                <w:sz w:val="20"/>
+                <w:szCs w:val="20"/>
+              </w:rPr>
+              <w:t xml:space="preserve">Ítem / plantilla que se usará en cada emisión.</w:t>
+            </w:r>
+          </w:p>
+        </w:tc>
+      </w:tr>
+      <w:tr>
+        <w:trPr/>
+        <w:tc>
+          <w:tcPr>
+            <w:tcW w:w="2800" w:type="dxa"/>
+            <w:noWrap/>
+          </w:tcPr>
+          <w:p>
+            <w:pPr/>
+            <w:r>
+              <w:rPr>
+                <w:sz w:val="20"/>
+                <w:szCs w:val="20"/>
+              </w:rPr>
+              <w:t xml:space="preserve">Vigencia desde / hasta</w:t>
+            </w:r>
+          </w:p>
+        </w:tc>
+        <w:tc>
+          <w:tcPr>
+            <w:tcW w:w="2800" w:type="dxa"/>
+            <w:noWrap/>
+          </w:tcPr>
+          <w:p>
+            <w:pPr/>
+            <w:r>
+              <w:rPr>
+                <w:sz w:val="20"/>
+                <w:szCs w:val="20"/>
+              </w:rPr>
+              <w:t xml:space="preserve">Rango en el que el abono puede generar períodos.</w:t>
+            </w:r>
+          </w:p>
+        </w:tc>
+      </w:tr>
+      <w:tr>
+        <w:trPr/>
+        <w:tc>
+          <w:tcPr>
+            <w:tcW w:w="2800" w:type="dxa"/>
+            <w:noWrap/>
+          </w:tcPr>
+          <w:p>
+            <w:pPr/>
+            <w:r>
+              <w:rPr>
+                <w:sz w:val="20"/>
+                <w:szCs w:val="20"/>
+              </w:rPr>
+              <w:t xml:space="preserve">Periodicidad</w:t>
+            </w:r>
+          </w:p>
+        </w:tc>
+        <w:tc>
+          <w:tcPr>
+            <w:tcW w:w="2800" w:type="dxa"/>
+            <w:noWrap/>
+          </w:tcPr>
+          <w:p>
+            <w:pPr/>
+            <w:r>
+              <w:rPr>
+                <w:sz w:val="20"/>
+                <w:szCs w:val="20"/>
+              </w:rPr>
+              <w:t xml:space="preserve">Mensual u otra frecuencia definida en el ABM (define la cola).</w:t>
+            </w:r>
+          </w:p>
+        </w:tc>
+      </w:tr>
+      <w:tr>
+        <w:trPr/>
+        <w:tc>
+          <w:tcPr>
+            <w:tcW w:w="2800" w:type="dxa"/>
+            <w:noWrap/>
+          </w:tcPr>
+          <w:p>
+            <w:pPr/>
+            <w:r>
+              <w:rPr>
+                <w:sz w:val="20"/>
+                <w:szCs w:val="20"/>
+              </w:rPr>
+              <w:t xml:space="preserve">Estado</w:t>
+            </w:r>
+          </w:p>
+        </w:tc>
+        <w:tc>
+          <w:tcPr>
+            <w:tcW w:w="2800" w:type="dxa"/>
+            <w:noWrap/>
+          </w:tcPr>
+          <w:p>
+            <w:pPr/>
+            <w:r>
+              <w:rPr>
+                <w:sz w:val="20"/>
+                <w:szCs w:val="20"/>
+              </w:rPr>
+              <w:t xml:space="preserve">Activo / suspendido / vencido según operatoria.</w:t>
+            </w:r>
+          </w:p>
+        </w:tc>
+      </w:tr>
+      <w:tr>
+        <w:trPr/>
+        <w:tc>
+          <w:tcPr>
+            <w:tcW w:w="2800" w:type="dxa"/>
+            <w:noWrap/>
+          </w:tcPr>
+          <w:p>
+            <w:pPr/>
+            <w:r>
+              <w:rPr>
+                <w:sz w:val="20"/>
+                <w:szCs w:val="20"/>
+              </w:rPr>
+              <w:t xml:space="preserve">Precio</w:t>
+            </w:r>
+          </w:p>
+        </w:tc>
+        <w:tc>
+          <w:tcPr>
+            <w:tcW w:w="2800" w:type="dxa"/>
+            <w:noWrap/>
+          </w:tcPr>
+          <w:p>
+            <w:pPr/>
+            <w:r>
+              <w:rPr>
+                <w:sz w:val="20"/>
+                <w:szCs w:val="20"/>
+              </w:rPr>
+              <w:t xml:space="preserve">Opcional; si no se informa, suele usarse el precio vigente del concepto.</w:t>
+            </w:r>
+          </w:p>
+        </w:tc>
+      </w:tr>
+      <w:tr>
+        <w:trPr/>
+        <w:tc>
+          <w:tcPr>
+            <w:tcW w:w="2800" w:type="dxa"/>
+            <w:noWrap/>
+          </w:tcPr>
+          <w:p>
+            <w:pPr/>
+            <w:r>
+              <w:rPr>
+                <w:sz w:val="20"/>
+                <w:szCs w:val="20"/>
+              </w:rPr>
+              <w:t xml:space="preserve">Datos fijos (tags)</w:t>
+            </w:r>
+          </w:p>
+        </w:tc>
+        <w:tc>
+          <w:tcPr>
+            <w:tcW w:w="2800" w:type="dxa"/>
+            <w:noWrap/>
+          </w:tcPr>
+          <w:p>
+            <w:pPr/>
+            <w:r>
+              <w:rPr>
+                <w:sz w:val="20"/>
+                <w:szCs w:val="20"/>
+              </w:rPr>
+              <w:t xml:space="preserve">Valores que no cambian cada mes (dominio, patente, etc.).</w:t>
+            </w:r>
+          </w:p>
+        </w:tc>
+      </w:tr>
+    </w:tbl>
+    <w:p/>
+    <w:p>
+      <w:pPr>
+        <w:pStyle w:val="Heading2"/>
+      </w:pPr>
+      <w:bookmarkStart w:id="18" w:name="_Toc18"/>
+      <w:r>
+        <w:t>18. Cola de facturación de abonos</w:t>
+      </w:r>
+      <w:bookmarkEnd w:id="18"/>
+    </w:p>
+    <w:p>
+      <w:pPr>
+        <w:jc w:val="both"/>
+        <w:spacing w:after="120"/>
+      </w:pPr>
+      <w:r>
+        <w:rPr>
+          <w:sz w:val="22"/>
+          <w:szCs w:val="22"/>
+        </w:rPr>
+        <w:t xml:space="preserve">La cola lista períodos pendientes de abonos activos según vigencia y periodicidad.</w:t>
+      </w:r>
+    </w:p>
+    <w:p>
+      <w:pPr>
+        <w:jc w:val="both"/>
+        <w:spacing w:after="120"/>
+      </w:pPr>
+      <w:r>
+        <w:rPr>
+          <w:sz w:val="22"/>
+          <w:szCs w:val="22"/>
+        </w:rPr>
+        <w:t xml:space="preserve">Acceso: Ventas → Abonos → Cola facturación abonos (ventas/contrato-venta-cola).</w:t>
+      </w:r>
+    </w:p>
+    <w:p>
+      <w:pPr>
+        <w:jc w:val="both"/>
+        <w:spacing w:after="120"/>
+      </w:pPr>
+      <w:r>
+        <w:rPr>
+          <w:sz w:val="22"/>
+          <w:szCs w:val="22"/>
+        </w:rPr>
+        <w:t xml:space="preserve">Seleccione uno o varios períodos y use la acción de facturar: el sistema abre (o prepara) el facturador con cliente, concepto, tags y período precargados.</w:t>
+      </w:r>
+    </w:p>
+    <w:p>
+      <w:pPr>
+        <w:jc w:val="both"/>
+        <w:spacing w:after="120"/>
+      </w:pPr>
+      <w:r>
+        <w:rPr>
+          <w:sz w:val="22"/>
+          <w:szCs w:val="22"/>
+          <w:i w:val="1"/>
+          <w:iCs w:val="1"/>
+        </w:rPr>
+        <w:t xml:space="preserve">Permisos: listar-contrato-venta-cola para ver la cola; facturar-contrato-venta-cola para enviar a facturar.</w:t>
+      </w:r>
+    </w:p>
+    <w:p>
+      <w:pPr>
+        <w:numPr>
+          <w:ilvl w:val="0"/>
+          <w:numId w:val=""/>
+        </w:numPr>
+      </w:pPr>
+      <w:r>
+        <w:rPr/>
+        <w:t xml:space="preserve">Filtre por empresa, cliente o rango de fechas si el volumen es alto.</w:t>
+      </w:r>
+    </w:p>
+    <w:p>
+      <w:pPr>
+        <w:numPr>
+          <w:ilvl w:val="0"/>
+          <w:numId w:val=""/>
+        </w:numPr>
+      </w:pPr>
+      <w:r>
+        <w:rPr/>
+        <w:t xml:space="preserve">Revise la descripción preview antes de confirmar la emisión ARCA.</w:t>
+      </w:r>
+    </w:p>
+    <w:p>
+      <w:pPr>
+        <w:numPr>
+          <w:ilvl w:val="0"/>
+          <w:numId w:val=""/>
+        </w:numPr>
+      </w:pPr>
+      <w:r>
+        <w:rPr/>
+        <w:t xml:space="preserve">Tras emitir correctamente, el período queda marcado como facturado y sale de la cola.</w:t>
+      </w:r>
+    </w:p>
+    <w:p>
+      <w:pPr>
+        <w:numPr>
+          <w:ilvl w:val="0"/>
+          <w:numId w:val=""/>
+        </w:numPr>
+      </w:pPr>
+      <w:r>
+        <w:rPr/>
+        <w:t xml:space="preserve">Si cancela a mitad de camino, el período sigue pendiente (no se marca facturado).</w:t>
+      </w:r>
+    </w:p>
+    <w:p/>
+    <w:p>
+      <w:pPr/>
+      <w:r>
+        <w:rPr>
+          <w:color w:val="2E75B6"/>
+          <w:sz w:val="22"/>
+          <w:szCs w:val="22"/>
+          <w:b w:val="1"/>
+          <w:bCs w:val="1"/>
+        </w:rPr>
+        <w:t xml:space="preserve">Herramientas de la pantalla</w:t>
+      </w:r>
+    </w:p>
+    <w:tbl>
+      <w:tblGrid>
+        <w:gridCol w:w="2800" w:type="dxa"/>
+        <w:gridCol w:w="2800" w:type="dxa"/>
+        <w:gridCol w:w="2800" w:type="dxa"/>
+        <w:gridCol w:w="2800" w:type="dxa"/>
+      </w:tblGrid>
+      <w:tblPr>
+        <w:tblW w:w="0" w:type="auto"/>
+        <w:tblLayout w:type="autofit"/>
+        <w:tblCellMar>
+          <w:top w:w="80" w:type="dxa"/>
+          <w:left w:w="80" w:type="dxa"/>
+          <w:right w:w="80" w:type="dxa"/>
+          <w:bottom w:w="80" w:type="dxa"/>
+        </w:tblCellMar>
+        <w:tblBorders>
+          <w:top w:val="single" w:sz="6" w:color="AAAAAA"/>
+          <w:left w:val="single" w:sz="6" w:color="AAAAAA"/>
+          <w:right w:val="single" w:sz="6" w:color="AAAAAA"/>
+          <w:bottom w:val="single" w:sz="6" w:color="AAAAAA"/>
+          <w:insideH w:val="single" w:sz="6" w:color="AAAAAA"/>
+          <w:insideV w:val="single" w:sz="6" w:color="AAAAAA"/>
+        </w:tblBorders>
+      </w:tblPr>
+      <w:tr>
+        <w:trPr/>
+        <w:tc>
+          <w:tcPr>
+            <w:tcW w:w="2800" w:type="dxa"/>
+            <w:shd w:val="clear" w:fill="2E75B6"/>
+            <w:noWrap/>
+          </w:tcPr>
+          <w:p>
+            <w:pPr/>
+            <w:r>
+              <w:rPr>
+                <w:color w:val="FFFFFF"/>
+                <w:sz w:val="20"/>
+                <w:szCs w:val="20"/>
+                <w:b w:val="1"/>
+                <w:bCs w:val="1"/>
+              </w:rPr>
+              <w:t xml:space="preserve">Herramienta</w:t>
+            </w:r>
+          </w:p>
+        </w:tc>
+        <w:tc>
+          <w:tcPr>
+            <w:tcW w:w="2800" w:type="dxa"/>
+            <w:shd w:val="clear" w:fill="2E75B6"/>
+            <w:noWrap/>
+          </w:tcPr>
+          <w:p>
+            <w:pPr/>
+            <w:r>
+              <w:rPr>
+                <w:color w:val="FFFFFF"/>
+                <w:sz w:val="20"/>
+                <w:szCs w:val="20"/>
+                <w:b w:val="1"/>
+                <w:bCs w:val="1"/>
+              </w:rPr>
+              <w:t xml:space="preserve">Ubicación</w:t>
+            </w:r>
+          </w:p>
+        </w:tc>
+        <w:tc>
+          <w:tcPr>
+            <w:tcW w:w="2800" w:type="dxa"/>
+            <w:shd w:val="clear" w:fill="2E75B6"/>
+            <w:noWrap/>
+          </w:tcPr>
+          <w:p>
+            <w:pPr/>
+            <w:r>
+              <w:rPr>
+                <w:color w:val="FFFFFF"/>
+                <w:sz w:val="20"/>
+                <w:szCs w:val="20"/>
+                <w:b w:val="1"/>
+                <w:bCs w:val="1"/>
+              </w:rPr>
+              <w:t xml:space="preserve">Qué hace</w:t>
+            </w:r>
+          </w:p>
+        </w:tc>
+        <w:tc>
+          <w:tcPr>
+            <w:tcW w:w="2800" w:type="dxa"/>
+            <w:shd w:val="clear" w:fill="2E75B6"/>
+            <w:noWrap/>
+          </w:tcPr>
+          <w:p>
+            <w:pPr/>
+            <w:r>
+              <w:rPr>
+                <w:color w:val="FFFFFF"/>
+                <w:sz w:val="20"/>
+                <w:szCs w:val="20"/>
+                <w:b w:val="1"/>
+                <w:bCs w:val="1"/>
+              </w:rPr>
+              <w:t xml:space="preserve">Permiso</w:t>
+            </w:r>
+          </w:p>
+        </w:tc>
+      </w:tr>
+      <w:tr>
+        <w:trPr/>
+        <w:tc>
+          <w:tcPr>
+            <w:tcW w:w="2800" w:type="dxa"/>
+            <w:noWrap/>
+          </w:tcPr>
+          <w:p>
+            <w:pPr/>
+            <w:r>
+              <w:rPr>
+                <w:sz w:val="20"/>
+                <w:szCs w:val="20"/>
+              </w:rPr>
+              <w:t xml:space="preserve">Consultar cola</w:t>
+            </w:r>
+          </w:p>
+        </w:tc>
+        <w:tc>
+          <w:tcPr>
+            <w:tcW w:w="2800" w:type="dxa"/>
+            <w:noWrap/>
+          </w:tcPr>
+          <w:p>
+            <w:pPr/>
+            <w:r>
+              <w:rPr>
+                <w:sz w:val="20"/>
+                <w:szCs w:val="20"/>
+              </w:rPr>
+              <w:t xml:space="preserve">Filtros de la pantalla</w:t>
+            </w:r>
+          </w:p>
+        </w:tc>
+        <w:tc>
+          <w:tcPr>
+            <w:tcW w:w="2800" w:type="dxa"/>
+            <w:noWrap/>
+          </w:tcPr>
+          <w:p>
+            <w:pPr/>
+            <w:r>
+              <w:rPr>
+                <w:sz w:val="20"/>
+                <w:szCs w:val="20"/>
+              </w:rPr>
+              <w:t xml:space="preserve">Lista períodos pendientes según vigencia y periodicidad.</w:t>
+            </w:r>
+          </w:p>
+        </w:tc>
+        <w:tc>
+          <w:tcPr>
+            <w:tcW w:w="2800" w:type="dxa"/>
+            <w:noWrap/>
+          </w:tcPr>
+          <w:p>
+            <w:pPr/>
+            <w:r>
+              <w:rPr>
+                <w:sz w:val="20"/>
+                <w:szCs w:val="20"/>
+              </w:rPr>
+              <w:t xml:space="preserve">listar-contrato-venta-cola</w:t>
+            </w:r>
+          </w:p>
+        </w:tc>
+      </w:tr>
+      <w:tr>
+        <w:trPr/>
+        <w:tc>
+          <w:tcPr>
+            <w:tcW w:w="2800" w:type="dxa"/>
+            <w:noWrap/>
+          </w:tcPr>
+          <w:p>
+            <w:pPr/>
+            <w:r>
+              <w:rPr>
+                <w:sz w:val="20"/>
+                <w:szCs w:val="20"/>
+              </w:rPr>
+              <w:t xml:space="preserve">Facturar selección</w:t>
+            </w:r>
+          </w:p>
+        </w:tc>
+        <w:tc>
+          <w:tcPr>
+            <w:tcW w:w="2800" w:type="dxa"/>
+            <w:noWrap/>
+          </w:tcPr>
+          <w:p>
+            <w:pPr/>
+            <w:r>
+              <w:rPr>
+                <w:sz w:val="20"/>
+                <w:szCs w:val="20"/>
+              </w:rPr>
+              <w:t xml:space="preserve">Toolbar / acciones</w:t>
+            </w:r>
+          </w:p>
+        </w:tc>
+        <w:tc>
+          <w:tcPr>
+            <w:tcW w:w="2800" w:type="dxa"/>
+            <w:noWrap/>
+          </w:tcPr>
+          <w:p>
+            <w:pPr/>
+            <w:r>
+              <w:rPr>
+                <w:sz w:val="20"/>
+                <w:szCs w:val="20"/>
+              </w:rPr>
+              <w:t xml:space="preserve">Envía abonos seleccionados al facturador con prefill.</w:t>
+            </w:r>
+          </w:p>
+        </w:tc>
+        <w:tc>
+          <w:tcPr>
+            <w:tcW w:w="2800" w:type="dxa"/>
+            <w:noWrap/>
+          </w:tcPr>
+          <w:p>
+            <w:pPr/>
+            <w:r>
+              <w:rPr>
+                <w:sz w:val="20"/>
+                <w:szCs w:val="20"/>
+              </w:rPr>
+              <w:t xml:space="preserve">facturar-contrato-venta-cola</w:t>
+            </w:r>
+          </w:p>
+        </w:tc>
+      </w:tr>
+    </w:tbl>
+    <w:p/>
+    <w:p>
+      <w:pPr>
+        <w:pStyle w:val="Heading2"/>
+      </w:pPr>
+      <w:bookmarkStart w:id="19" w:name="_Toc19"/>
+      <w:r>
+        <w:t>19. Facturar un abono (paso a paso)</w:t>
+      </w:r>
+      <w:bookmarkEnd w:id="19"/>
+    </w:p>
+    <w:p>
+      <w:pPr>
+        <w:jc w:val="both"/>
+        <w:spacing w:after="120"/>
+      </w:pPr>
+      <w:r>
+        <w:rPr>
+          <w:sz w:val="22"/>
+          <w:szCs w:val="22"/>
+        </w:rPr>
+        <w:t xml:space="preserve">Puede facturar desde la cola (recomendado) o eligiendo el concepto/abono en el facturador de Ventas.</w:t>
+      </w:r>
+    </w:p>
+    <w:p>
+      <w:pPr>
+        <w:numPr>
+          <w:ilvl w:val="0"/>
+          <w:numId w:val=""/>
+        </w:numPr>
+      </w:pPr>
+      <w:r>
+        <w:rPr/>
+        <w:t xml:space="preserve">Abra la cola o el abono y dispare Facturar / Prefill.</w:t>
+      </w:r>
+    </w:p>
+    <w:p>
+      <w:pPr>
+        <w:numPr>
+          <w:ilvl w:val="0"/>
+          <w:numId w:val=""/>
+        </w:numPr>
+      </w:pPr>
+      <w:r>
+        <w:rPr/>
+        <w:t xml:space="preserve">Verifique cliente, PV, tipo de comprobante y actividad ARCA como en cualquier factura.</w:t>
+      </w:r>
+    </w:p>
+    <w:p>
+      <w:pPr>
+        <w:numPr>
+          <w:ilvl w:val="0"/>
+          <w:numId w:val=""/>
+        </w:numPr>
+      </w:pPr>
+      <w:r>
+        <w:rPr/>
+        <w:t xml:space="preserve">Si aparecen tags pedibles sin valor, complete el modal (por ejemplo período del mes).</w:t>
+      </w:r>
+    </w:p>
+    <w:p>
+      <w:pPr>
+        <w:numPr>
+          <w:ilvl w:val="0"/>
+          <w:numId w:val=""/>
+        </w:numPr>
+      </w:pPr>
+      <w:r>
+        <w:rPr/>
+        <w:t xml:space="preserve">Confirme que la descripción del renglón ya no muestra @clave@.</w:t>
+      </w:r>
+    </w:p>
+    <w:p>
+      <w:pPr>
+        <w:numPr>
+          <w:ilvl w:val="0"/>
+          <w:numId w:val=""/>
+        </w:numPr>
+      </w:pPr>
+      <w:r>
+        <w:rPr/>
+        <w:t xml:space="preserve">Genere la factura. Conserve el PDF / número ARCA.</w:t>
+      </w:r>
+    </w:p>
+    <w:p>
+      <w:pPr>
+        <w:numPr>
+          <w:ilvl w:val="0"/>
+          <w:numId w:val=""/>
+        </w:numPr>
+      </w:pPr>
+      <w:r>
+        <w:rPr/>
+        <w:t xml:space="preserve">Controle en el abono que el período figure como facturado.</w:t>
+      </w:r>
+    </w:p>
+    <w:p/>
+    <w:p>
+      <w:pPr>
+        <w:jc w:val="both"/>
+        <w:spacing w:after="120"/>
+      </w:pPr>
+      <w:r>
+        <w:rPr>
+          <w:sz w:val="22"/>
+          <w:szCs w:val="22"/>
+        </w:rPr>
+        <w:t xml:space="preserve">También puede facturar un concepto suelto (sin abono): elija el concepto en el facturador; si tiene tags pedibles, el modal pide los valores y arma la descripción. Los tags de sistema se completan solos.</w:t>
+      </w:r>
+    </w:p>
+    <w:p>
+      <w:pPr>
+        <w:pStyle w:val="Heading2"/>
+      </w:pPr>
+      <w:bookmarkStart w:id="20" w:name="_Toc20"/>
+      <w:r>
+        <w:t>20. Avisos de vencimiento de abonos</w:t>
+      </w:r>
+      <w:bookmarkEnd w:id="20"/>
+    </w:p>
+    <w:p>
+      <w:pPr>
+        <w:jc w:val="both"/>
+        <w:spacing w:after="120"/>
+      </w:pPr>
+      <w:r>
+        <w:rPr>
+          <w:sz w:val="22"/>
+          <w:szCs w:val="22"/>
+        </w:rPr>
+        <w:t xml:space="preserve">El sistema puede avisar por correo los abonos próximos a vencer o ya vencidos. El aviso no factura: solo alerta a administración para renovar, suspender o facturar el último período.</w:t>
+      </w:r>
+    </w:p>
+    <w:p>
+      <w:pPr>
+        <w:numPr>
+          <w:ilvl w:val="0"/>
+          <w:numId w:val=""/>
+        </w:numPr>
+      </w:pPr>
+      <w:r>
+        <w:rPr/>
+        <w:t xml:space="preserve">Comando: php artisan ventas:avisar-contratos-venta-vencimiento (opción --dry-run para listar sin enviar).</w:t>
+      </w:r>
+    </w:p>
+    <w:p>
+      <w:pPr>
+        <w:numPr>
+          <w:ilvl w:val="0"/>
+          <w:numId w:val=""/>
+        </w:numPr>
+      </w:pPr>
+      <w:r>
+        <w:rPr/>
+        <w:t xml:space="preserve">El cron del servidor debe estar activo para que el schedule de Laravel ejecute el aviso a la hora configurada.</w:t>
+      </w:r>
+    </w:p>
+    <w:p>
+      <w:pPr>
+        <w:numPr>
+          <w:ilvl w:val="0"/>
+          <w:numId w:val=""/>
+        </w:numPr>
+      </w:pPr>
+      <w:r>
+        <w:rPr/>
+        <w:t xml:space="preserve">Si no hay emails configurados, el comando no tiene a quién notificar: complete FACTURACION_CONTRATO_VENTA_AVISO_EMAILS.</w:t>
+      </w:r>
+    </w:p>
+    <w:p/>
+    <w:p>
+      <w:pPr/>
+      <w:r>
+        <w:rPr>
+          <w:color w:val="666666"/>
+          <w:sz w:val="18"/>
+          <w:szCs w:val="18"/>
+          <w:i w:val="1"/>
+          <w:iCs w:val="1"/>
+        </w:rPr>
+        <w:t xml:space="preserve">Configuración (.env / facturación)</w:t>
+      </w:r>
+    </w:p>
+    <w:tbl>
+      <w:tblGrid>
+        <w:gridCol w:w="2800" w:type="dxa"/>
+        <w:gridCol w:w="2800" w:type="dxa"/>
+      </w:tblGrid>
+      <w:tblPr>
+        <w:tblW w:w="0" w:type="auto"/>
+        <w:tblLayout w:type="autofit"/>
+        <w:tblCellMar>
+          <w:top w:w="80" w:type="dxa"/>
+          <w:left w:w="80" w:type="dxa"/>
+          <w:right w:w="80" w:type="dxa"/>
+          <w:bottom w:w="80" w:type="dxa"/>
+        </w:tblCellMar>
+        <w:tblBorders>
+          <w:top w:val="single" w:sz="6" w:color="AAAAAA"/>
+          <w:left w:val="single" w:sz="6" w:color="AAAAAA"/>
+          <w:right w:val="single" w:sz="6" w:color="AAAAAA"/>
+          <w:bottom w:val="single" w:sz="6" w:color="AAAAAA"/>
+          <w:insideH w:val="single" w:sz="6" w:color="AAAAAA"/>
+          <w:insideV w:val="single" w:sz="6" w:color="AAAAAA"/>
+        </w:tblBorders>
+      </w:tblPr>
+      <w:tr>
+        <w:trPr/>
+        <w:tc>
+          <w:tcPr>
+            <w:tcW w:w="2800" w:type="dxa"/>
+            <w:shd w:val="clear" w:fill="2E75B6"/>
+            <w:noWrap/>
+          </w:tcPr>
+          <w:p>
+            <w:pPr/>
+            <w:r>
+              <w:rPr>
+                <w:color w:val="FFFFFF"/>
+                <w:sz w:val="20"/>
+                <w:szCs w:val="20"/>
+                <w:b w:val="1"/>
+                <w:bCs w:val="1"/>
+              </w:rPr>
+              <w:t xml:space="preserve">Variable</w:t>
+            </w:r>
+          </w:p>
+        </w:tc>
+        <w:tc>
+          <w:tcPr>
+            <w:tcW w:w="2800" w:type="dxa"/>
+            <w:shd w:val="clear" w:fill="2E75B6"/>
+            <w:noWrap/>
+          </w:tcPr>
+          <w:p>
+            <w:pPr/>
+            <w:r>
+              <w:rPr>
+                <w:color w:val="FFFFFF"/>
+                <w:sz w:val="20"/>
+                <w:szCs w:val="20"/>
+                <w:b w:val="1"/>
+                <w:bCs w:val="1"/>
+              </w:rPr>
+              <w:t xml:space="preserve">Significado</w:t>
+            </w:r>
+          </w:p>
+        </w:tc>
+      </w:tr>
+      <w:tr>
+        <w:trPr/>
+        <w:tc>
+          <w:tcPr>
+            <w:tcW w:w="2800" w:type="dxa"/>
+            <w:noWrap/>
+          </w:tcPr>
+          <w:p>
+            <w:pPr/>
+            <w:r>
+              <w:rPr>
+                <w:sz w:val="20"/>
+                <w:szCs w:val="20"/>
+              </w:rPr>
+              <w:t xml:space="preserve">FACTURACION_CONTRATO_VENTA_AVISO_HABILITADO</w:t>
+            </w:r>
+          </w:p>
+        </w:tc>
+        <w:tc>
+          <w:tcPr>
+            <w:tcW w:w="2800" w:type="dxa"/>
+            <w:noWrap/>
+          </w:tcPr>
+          <w:p>
+            <w:pPr/>
+            <w:r>
+              <w:rPr>
+                <w:sz w:val="20"/>
+                <w:szCs w:val="20"/>
+              </w:rPr>
+              <w:t xml:space="preserve">true/false — activa el aviso diario</w:t>
+            </w:r>
+          </w:p>
+        </w:tc>
+      </w:tr>
+      <w:tr>
+        <w:trPr/>
+        <w:tc>
+          <w:tcPr>
+            <w:tcW w:w="2800" w:type="dxa"/>
+            <w:noWrap/>
+          </w:tcPr>
+          <w:p>
+            <w:pPr/>
+            <w:r>
+              <w:rPr>
+                <w:sz w:val="20"/>
+                <w:szCs w:val="20"/>
+              </w:rPr>
+              <w:t xml:space="preserve">FACTURACION_CONTRATO_VENTA_AVISO_DIAS</w:t>
+            </w:r>
+          </w:p>
+        </w:tc>
+        <w:tc>
+          <w:tcPr>
+            <w:tcW w:w="2800" w:type="dxa"/>
+            <w:noWrap/>
+          </w:tcPr>
+          <w:p>
+            <w:pPr/>
+            <w:r>
+              <w:rPr>
+                <w:sz w:val="20"/>
+                <w:szCs w:val="20"/>
+              </w:rPr>
+              <w:t xml:space="preserve">Días de anticipación (ej. 15)</w:t>
+            </w:r>
+          </w:p>
+        </w:tc>
+      </w:tr>
+      <w:tr>
+        <w:trPr/>
+        <w:tc>
+          <w:tcPr>
+            <w:tcW w:w="2800" w:type="dxa"/>
+            <w:noWrap/>
+          </w:tcPr>
+          <w:p>
+            <w:pPr/>
+            <w:r>
+              <w:rPr>
+                <w:sz w:val="20"/>
+                <w:szCs w:val="20"/>
+              </w:rPr>
+              <w:t xml:space="preserve">FACTURACION_CONTRATO_VENTA_AVISO_HORA</w:t>
+            </w:r>
+          </w:p>
+        </w:tc>
+        <w:tc>
+          <w:tcPr>
+            <w:tcW w:w="2800" w:type="dxa"/>
+            <w:noWrap/>
+          </w:tcPr>
+          <w:p>
+            <w:pPr/>
+            <w:r>
+              <w:rPr>
+                <w:sz w:val="20"/>
+                <w:szCs w:val="20"/>
+              </w:rPr>
+              <w:t xml:space="preserve">Hora del cron (ej. 09:20)</w:t>
+            </w:r>
+          </w:p>
+        </w:tc>
+      </w:tr>
+      <w:tr>
+        <w:trPr/>
+        <w:tc>
+          <w:tcPr>
+            <w:tcW w:w="2800" w:type="dxa"/>
+            <w:noWrap/>
+          </w:tcPr>
+          <w:p>
+            <w:pPr/>
+            <w:r>
+              <w:rPr>
+                <w:sz w:val="20"/>
+                <w:szCs w:val="20"/>
+              </w:rPr>
+              <w:t xml:space="preserve">FACTURACION_CONTRATO_VENTA_AVISO_EMAILS</w:t>
+            </w:r>
+          </w:p>
+        </w:tc>
+        <w:tc>
+          <w:tcPr>
+            <w:tcW w:w="2800" w:type="dxa"/>
+            <w:noWrap/>
+          </w:tcPr>
+          <w:p>
+            <w:pPr/>
+            <w:r>
+              <w:rPr>
+                <w:sz w:val="20"/>
+                <w:szCs w:val="20"/>
+              </w:rPr>
+              <w:t xml:space="preserve">Destinatarios separados por coma</w:t>
             </w:r>
           </w:p>
         </w:tc>

</xml_diff>